<commit_message>
feat : ajout authentification utilisateur
</commit_message>
<xml_diff>
--- a/docs/XX_EP_Journal_de_Bord.docx
+++ b/docs/XX_EP_Journal_de_Bord.docx
@@ -2225,16 +2225,8 @@
     </w:p>
     <w:p/>
     <w:p>
-      <w:pPr>
-        <w:pStyle w:val="Titre1"/>
-      </w:pPr>
-      <w:r>
-        <w:t>Sprint 6 : PHP connexion PDO</w:t>
-      </w:r>
-    </w:p>
-    <w:p>
-      <w:r>
-        <w:t>Après une balise PHP,</w:t>
+      <w:r>
+        <w:t>Code : en SQL</w:t>
       </w:r>
     </w:p>
     <w:p>
@@ -2243,74 +2235,22 @@
         <w:spacing w:after="0" w:line="285" w:lineRule="atLeast"/>
         <w:rPr>
           <w:rFonts w:ascii="Consolas" w:eastAsia="Times New Roman" w:hAnsi="Consolas" w:cs="Times New Roman"/>
-          <w:color w:val="FFFFFF"/>
-          <w:sz w:val="21"/>
-          <w:szCs w:val="21"/>
-          <w:lang w:eastAsia="fr-FR"/>
-        </w:rPr>
-      </w:pPr>
-      <w:r>
-        <w:rPr>
-          <w:rFonts w:ascii="Consolas" w:eastAsia="Times New Roman" w:hAnsi="Consolas" w:cs="Times New Roman"/>
-          <w:color w:val="9CDCFE"/>
-          <w:sz w:val="21"/>
-          <w:szCs w:val="21"/>
-          <w:lang w:eastAsia="fr-FR"/>
-        </w:rPr>
-        <w:t>$host</w:t>
-      </w:r>
-      <w:r>
-        <w:rPr>
-          <w:rFonts w:ascii="Consolas" w:eastAsia="Times New Roman" w:hAnsi="Consolas" w:cs="Times New Roman"/>
-          <w:color w:val="FFFFFF"/>
-          <w:sz w:val="21"/>
-          <w:szCs w:val="21"/>
-          <w:lang w:eastAsia="fr-FR"/>
-        </w:rPr>
-        <w:t xml:space="preserve"> </w:t>
-      </w:r>
-      <w:r>
-        <w:rPr>
-          <w:rFonts w:ascii="Consolas" w:eastAsia="Times New Roman" w:hAnsi="Consolas" w:cs="Times New Roman"/>
-          <w:color w:val="D4D4D4"/>
-          <w:sz w:val="21"/>
-          <w:szCs w:val="21"/>
-          <w:lang w:eastAsia="fr-FR"/>
-        </w:rPr>
-        <w:t>=</w:t>
-      </w:r>
-      <w:r>
-        <w:rPr>
-          <w:rFonts w:ascii="Consolas" w:eastAsia="Times New Roman" w:hAnsi="Consolas" w:cs="Times New Roman"/>
-          <w:color w:val="FFFFFF"/>
-          <w:sz w:val="21"/>
-          <w:szCs w:val="21"/>
-          <w:lang w:eastAsia="fr-FR"/>
-        </w:rPr>
-        <w:t xml:space="preserve"> </w:t>
-      </w:r>
-      <w:r>
-        <w:rPr>
-          <w:rFonts w:ascii="Consolas" w:eastAsia="Times New Roman" w:hAnsi="Consolas" w:cs="Times New Roman"/>
-          <w:color w:val="CE9178"/>
-          <w:sz w:val="21"/>
-          <w:szCs w:val="21"/>
-          <w:lang w:eastAsia="fr-FR"/>
-        </w:rPr>
-        <w:t>"</w:t>
-      </w:r>
-      <w:proofErr w:type="spellStart"/>
-      <w:r>
-        <w:rPr>
-          <w:rFonts w:ascii="Consolas" w:eastAsia="Times New Roman" w:hAnsi="Consolas" w:cs="Times New Roman"/>
-          <w:color w:val="CE9178"/>
-          <w:sz w:val="21"/>
-          <w:szCs w:val="21"/>
-          <w:lang w:eastAsia="fr-FR"/>
-        </w:rPr>
-        <w:t>localhost</w:t>
-      </w:r>
-      <w:proofErr w:type="spellEnd"/>
+          <w:color w:val="CE9178"/>
+          <w:sz w:val="21"/>
+          <w:szCs w:val="21"/>
+          <w:lang w:eastAsia="fr-FR"/>
+        </w:rPr>
+      </w:pPr>
+      <w:r>
+        <w:rPr>
+          <w:rFonts w:ascii="Consolas" w:eastAsia="Times New Roman" w:hAnsi="Consolas" w:cs="Times New Roman"/>
+          <w:color w:val="CE9178"/>
+          <w:sz w:val="21"/>
+          <w:szCs w:val="21"/>
+          <w:lang w:eastAsia="fr-FR"/>
+        </w:rPr>
+        <w:t xml:space="preserve">CREATE TABLE </w:t>
+      </w:r>
       <w:proofErr w:type="gramStart"/>
       <w:r>
         <w:rPr>
@@ -2320,39 +2260,9 @@
           <w:szCs w:val="21"/>
           <w:lang w:eastAsia="fr-FR"/>
         </w:rPr>
-        <w:t>"</w:t>
-      </w:r>
-      <w:r>
-        <w:rPr>
-          <w:rFonts w:ascii="Consolas" w:eastAsia="Times New Roman" w:hAnsi="Consolas" w:cs="Times New Roman"/>
-          <w:color w:val="FFFFFF"/>
-          <w:sz w:val="21"/>
-          <w:szCs w:val="21"/>
-          <w:lang w:eastAsia="fr-FR"/>
-        </w:rPr>
-        <w:t>;</w:t>
-      </w:r>
-      <w:r>
-        <w:rPr>
-          <w:rFonts w:ascii="Consolas" w:eastAsia="Times New Roman" w:hAnsi="Consolas" w:cs="Times New Roman"/>
-          <w:color w:val="FFFFFF"/>
-          <w:sz w:val="21"/>
-          <w:szCs w:val="21"/>
-          <w:lang w:eastAsia="fr-FR"/>
-        </w:rPr>
-        <w:t xml:space="preserve">   </w:t>
+        <w:t>utilisateur(</w:t>
       </w:r>
       <w:proofErr w:type="gramEnd"/>
-      <w:r>
-        <w:rPr>
-          <w:rFonts w:ascii="Consolas" w:eastAsia="Times New Roman" w:hAnsi="Consolas" w:cs="Times New Roman"/>
-          <w:color w:val="FFFFFF"/>
-          <w:sz w:val="21"/>
-          <w:szCs w:val="21"/>
-          <w:lang w:eastAsia="fr-FR"/>
-        </w:rPr>
-        <w:t>// il est plus simple de stocker sous forme de variable car s’il y a une modification, on aura qu’à le modifier ici. =&gt; Simplifie la maintenabilité</w:t>
-      </w:r>
     </w:p>
     <w:p>
       <w:pPr>
@@ -2360,66 +2270,23 @@
         <w:spacing w:after="0" w:line="285" w:lineRule="atLeast"/>
         <w:rPr>
           <w:rFonts w:ascii="Consolas" w:eastAsia="Times New Roman" w:hAnsi="Consolas" w:cs="Times New Roman"/>
-          <w:color w:val="FFFFFF"/>
-          <w:sz w:val="21"/>
-          <w:szCs w:val="21"/>
-          <w:lang w:eastAsia="fr-FR"/>
-        </w:rPr>
-      </w:pPr>
-      <w:r>
-        <w:rPr>
-          <w:rFonts w:ascii="Consolas" w:eastAsia="Times New Roman" w:hAnsi="Consolas" w:cs="Times New Roman"/>
-          <w:color w:val="9CDCFE"/>
-          <w:sz w:val="21"/>
-          <w:szCs w:val="21"/>
-          <w:lang w:eastAsia="fr-FR"/>
-        </w:rPr>
-        <w:t>$</w:t>
-      </w:r>
-      <w:proofErr w:type="spellStart"/>
-      <w:r>
-        <w:rPr>
-          <w:rFonts w:ascii="Consolas" w:eastAsia="Times New Roman" w:hAnsi="Consolas" w:cs="Times New Roman"/>
-          <w:color w:val="9CDCFE"/>
-          <w:sz w:val="21"/>
-          <w:szCs w:val="21"/>
-          <w:lang w:eastAsia="fr-FR"/>
-        </w:rPr>
-        <w:t>dbname</w:t>
-      </w:r>
-      <w:proofErr w:type="spellEnd"/>
-      <w:r>
-        <w:rPr>
-          <w:rFonts w:ascii="Consolas" w:eastAsia="Times New Roman" w:hAnsi="Consolas" w:cs="Times New Roman"/>
-          <w:color w:val="D4D4D4"/>
-          <w:sz w:val="21"/>
-          <w:szCs w:val="21"/>
-          <w:lang w:eastAsia="fr-FR"/>
-        </w:rPr>
-        <w:t>=</w:t>
-      </w:r>
-      <w:r>
-        <w:rPr>
-          <w:rFonts w:ascii="Consolas" w:eastAsia="Times New Roman" w:hAnsi="Consolas" w:cs="Times New Roman"/>
-          <w:color w:val="CE9178"/>
-          <w:sz w:val="21"/>
-          <w:szCs w:val="21"/>
-          <w:lang w:eastAsia="fr-FR"/>
-        </w:rPr>
-        <w:t>"</w:t>
-      </w:r>
-      <w:proofErr w:type="spellStart"/>
-      <w:r>
-        <w:rPr>
-          <w:rFonts w:ascii="Consolas" w:eastAsia="Times New Roman" w:hAnsi="Consolas" w:cs="Times New Roman"/>
-          <w:color w:val="CE9178"/>
-          <w:sz w:val="21"/>
-          <w:szCs w:val="21"/>
-          <w:lang w:eastAsia="fr-FR"/>
-        </w:rPr>
-        <w:t>entrepages</w:t>
-      </w:r>
-      <w:proofErr w:type="spellEnd"/>
+          <w:color w:val="CE9178"/>
+          <w:sz w:val="21"/>
+          <w:szCs w:val="21"/>
+          <w:lang w:eastAsia="fr-FR"/>
+        </w:rPr>
+      </w:pPr>
+      <w:r>
+        <w:rPr>
+          <w:rFonts w:ascii="Consolas" w:eastAsia="Times New Roman" w:hAnsi="Consolas" w:cs="Times New Roman"/>
+          <w:color w:val="CE9178"/>
+          <w:sz w:val="21"/>
+          <w:szCs w:val="21"/>
+          <w:lang w:eastAsia="fr-FR"/>
+        </w:rPr>
+        <w:tab/>
+      </w:r>
+      <w:proofErr w:type="spellStart"/>
       <w:proofErr w:type="gramStart"/>
       <w:r>
         <w:rPr>
@@ -2429,19 +2296,30 @@
           <w:szCs w:val="21"/>
           <w:lang w:eastAsia="fr-FR"/>
         </w:rPr>
-        <w:t>"</w:t>
-      </w:r>
-      <w:r>
-        <w:rPr>
-          <w:rFonts w:ascii="Consolas" w:eastAsia="Times New Roman" w:hAnsi="Consolas" w:cs="Times New Roman"/>
-          <w:color w:val="FFFFFF"/>
-          <w:sz w:val="21"/>
-          <w:szCs w:val="21"/>
-          <w:lang w:eastAsia="fr-FR"/>
-        </w:rPr>
-        <w:t>;</w:t>
+        <w:t>id</w:t>
       </w:r>
       <w:proofErr w:type="gramEnd"/>
+      <w:r>
+        <w:rPr>
+          <w:rFonts w:ascii="Consolas" w:eastAsia="Times New Roman" w:hAnsi="Consolas" w:cs="Times New Roman"/>
+          <w:color w:val="CE9178"/>
+          <w:sz w:val="21"/>
+          <w:szCs w:val="21"/>
+          <w:lang w:eastAsia="fr-FR"/>
+        </w:rPr>
+        <w:t>_utilisateur</w:t>
+      </w:r>
+      <w:proofErr w:type="spellEnd"/>
+      <w:r>
+        <w:rPr>
+          <w:rFonts w:ascii="Consolas" w:eastAsia="Times New Roman" w:hAnsi="Consolas" w:cs="Times New Roman"/>
+          <w:color w:val="CE9178"/>
+          <w:sz w:val="21"/>
+          <w:szCs w:val="21"/>
+          <w:lang w:eastAsia="fr-FR"/>
+        </w:rPr>
+        <w:t xml:space="preserve"> INT PRIMARY KEY AUTO_INCREMENT,</w:t>
+      </w:r>
     </w:p>
     <w:p>
       <w:pPr>
@@ -2449,66 +2327,22 @@
         <w:spacing w:after="0" w:line="285" w:lineRule="atLeast"/>
         <w:rPr>
           <w:rFonts w:ascii="Consolas" w:eastAsia="Times New Roman" w:hAnsi="Consolas" w:cs="Times New Roman"/>
-          <w:color w:val="FFFFFF"/>
-          <w:sz w:val="21"/>
-          <w:szCs w:val="21"/>
-          <w:lang w:eastAsia="fr-FR"/>
-        </w:rPr>
-      </w:pPr>
-      <w:r>
-        <w:rPr>
-          <w:rFonts w:ascii="Consolas" w:eastAsia="Times New Roman" w:hAnsi="Consolas" w:cs="Times New Roman"/>
-          <w:color w:val="9CDCFE"/>
-          <w:sz w:val="21"/>
-          <w:szCs w:val="21"/>
-          <w:lang w:eastAsia="fr-FR"/>
-        </w:rPr>
-        <w:t>$</w:t>
-      </w:r>
-      <w:proofErr w:type="spellStart"/>
-      <w:r>
-        <w:rPr>
-          <w:rFonts w:ascii="Consolas" w:eastAsia="Times New Roman" w:hAnsi="Consolas" w:cs="Times New Roman"/>
-          <w:color w:val="9CDCFE"/>
-          <w:sz w:val="21"/>
-          <w:szCs w:val="21"/>
-          <w:lang w:eastAsia="fr-FR"/>
-        </w:rPr>
-        <w:t>username</w:t>
-      </w:r>
-      <w:proofErr w:type="spellEnd"/>
-      <w:r>
-        <w:rPr>
-          <w:rFonts w:ascii="Consolas" w:eastAsia="Times New Roman" w:hAnsi="Consolas" w:cs="Times New Roman"/>
-          <w:color w:val="D4D4D4"/>
-          <w:sz w:val="21"/>
-          <w:szCs w:val="21"/>
-          <w:lang w:eastAsia="fr-FR"/>
-        </w:rPr>
-        <w:t>=</w:t>
-      </w:r>
-      <w:r>
-        <w:rPr>
-          <w:rFonts w:ascii="Consolas" w:eastAsia="Times New Roman" w:hAnsi="Consolas" w:cs="Times New Roman"/>
-          <w:color w:val="CE9178"/>
-          <w:sz w:val="21"/>
-          <w:szCs w:val="21"/>
-          <w:lang w:eastAsia="fr-FR"/>
-        </w:rPr>
-        <w:t>"</w:t>
-      </w:r>
-      <w:proofErr w:type="spellStart"/>
-      <w:r>
-        <w:rPr>
-          <w:rFonts w:ascii="Consolas" w:eastAsia="Times New Roman" w:hAnsi="Consolas" w:cs="Times New Roman"/>
-          <w:color w:val="CE9178"/>
-          <w:sz w:val="21"/>
-          <w:szCs w:val="21"/>
-          <w:lang w:eastAsia="fr-FR"/>
-        </w:rPr>
-        <w:t>root</w:t>
-      </w:r>
-      <w:proofErr w:type="spellEnd"/>
+          <w:color w:val="CE9178"/>
+          <w:sz w:val="21"/>
+          <w:szCs w:val="21"/>
+          <w:lang w:eastAsia="fr-FR"/>
+        </w:rPr>
+      </w:pPr>
+      <w:r>
+        <w:rPr>
+          <w:rFonts w:ascii="Consolas" w:eastAsia="Times New Roman" w:hAnsi="Consolas" w:cs="Times New Roman"/>
+          <w:color w:val="CE9178"/>
+          <w:sz w:val="21"/>
+          <w:szCs w:val="21"/>
+          <w:lang w:eastAsia="fr-FR"/>
+        </w:rPr>
+        <w:tab/>
+      </w:r>
       <w:proofErr w:type="gramStart"/>
       <w:r>
         <w:rPr>
@@ -2518,19 +2352,19 @@
           <w:szCs w:val="21"/>
           <w:lang w:eastAsia="fr-FR"/>
         </w:rPr>
-        <w:t>"</w:t>
-      </w:r>
-      <w:r>
-        <w:rPr>
-          <w:rFonts w:ascii="Consolas" w:eastAsia="Times New Roman" w:hAnsi="Consolas" w:cs="Times New Roman"/>
-          <w:color w:val="FFFFFF"/>
-          <w:sz w:val="21"/>
-          <w:szCs w:val="21"/>
-          <w:lang w:eastAsia="fr-FR"/>
-        </w:rPr>
-        <w:t>;</w:t>
+        <w:t>nom</w:t>
       </w:r>
       <w:proofErr w:type="gramEnd"/>
+      <w:r>
+        <w:rPr>
+          <w:rFonts w:ascii="Consolas" w:eastAsia="Times New Roman" w:hAnsi="Consolas" w:cs="Times New Roman"/>
+          <w:color w:val="CE9178"/>
+          <w:sz w:val="21"/>
+          <w:szCs w:val="21"/>
+          <w:lang w:eastAsia="fr-FR"/>
+        </w:rPr>
+        <w:t xml:space="preserve"> VARCHAR(50) NOT NULL,</w:t>
+      </w:r>
     </w:p>
     <w:p>
       <w:pPr>
@@ -2538,11 +2372,1752 @@
         <w:spacing w:after="0" w:line="285" w:lineRule="atLeast"/>
         <w:rPr>
           <w:rFonts w:ascii="Consolas" w:eastAsia="Times New Roman" w:hAnsi="Consolas" w:cs="Times New Roman"/>
+          <w:color w:val="CE9178"/>
+          <w:sz w:val="21"/>
+          <w:szCs w:val="21"/>
+          <w:lang w:eastAsia="fr-FR"/>
+        </w:rPr>
+      </w:pPr>
+      <w:r>
+        <w:rPr>
+          <w:rFonts w:ascii="Consolas" w:eastAsia="Times New Roman" w:hAnsi="Consolas" w:cs="Times New Roman"/>
+          <w:color w:val="CE9178"/>
+          <w:sz w:val="21"/>
+          <w:szCs w:val="21"/>
+          <w:lang w:eastAsia="fr-FR"/>
+        </w:rPr>
+        <w:tab/>
+      </w:r>
+      <w:proofErr w:type="spellStart"/>
+      <w:proofErr w:type="gramStart"/>
+      <w:r>
+        <w:rPr>
+          <w:rFonts w:ascii="Consolas" w:eastAsia="Times New Roman" w:hAnsi="Consolas" w:cs="Times New Roman"/>
+          <w:color w:val="CE9178"/>
+          <w:sz w:val="21"/>
+          <w:szCs w:val="21"/>
+          <w:lang w:eastAsia="fr-FR"/>
+        </w:rPr>
+        <w:t>prenom</w:t>
+      </w:r>
+      <w:proofErr w:type="spellEnd"/>
+      <w:proofErr w:type="gramEnd"/>
+      <w:r>
+        <w:rPr>
+          <w:rFonts w:ascii="Consolas" w:eastAsia="Times New Roman" w:hAnsi="Consolas" w:cs="Times New Roman"/>
+          <w:color w:val="CE9178"/>
+          <w:sz w:val="21"/>
+          <w:szCs w:val="21"/>
+          <w:lang w:eastAsia="fr-FR"/>
+        </w:rPr>
+        <w:t xml:space="preserve"> VARCHAR(50) NOT NULL,</w:t>
+      </w:r>
+    </w:p>
+    <w:p>
+      <w:pPr>
+        <w:shd w:val="clear" w:color="auto" w:fill="000000"/>
+        <w:spacing w:after="0" w:line="285" w:lineRule="atLeast"/>
+        <w:rPr>
+          <w:rFonts w:ascii="Consolas" w:eastAsia="Times New Roman" w:hAnsi="Consolas" w:cs="Times New Roman"/>
+          <w:color w:val="CE9178"/>
+          <w:sz w:val="21"/>
+          <w:szCs w:val="21"/>
+          <w:lang w:eastAsia="fr-FR"/>
+        </w:rPr>
+      </w:pPr>
+      <w:r>
+        <w:rPr>
+          <w:rFonts w:ascii="Consolas" w:eastAsia="Times New Roman" w:hAnsi="Consolas" w:cs="Times New Roman"/>
+          <w:color w:val="CE9178"/>
+          <w:sz w:val="21"/>
+          <w:szCs w:val="21"/>
+          <w:lang w:eastAsia="fr-FR"/>
+        </w:rPr>
+        <w:tab/>
+      </w:r>
+      <w:proofErr w:type="gramStart"/>
+      <w:r>
+        <w:rPr>
+          <w:rFonts w:ascii="Consolas" w:eastAsia="Times New Roman" w:hAnsi="Consolas" w:cs="Times New Roman"/>
+          <w:color w:val="CE9178"/>
+          <w:sz w:val="21"/>
+          <w:szCs w:val="21"/>
+          <w:lang w:eastAsia="fr-FR"/>
+        </w:rPr>
+        <w:t>pseudo</w:t>
+      </w:r>
+      <w:proofErr w:type="gramEnd"/>
+      <w:r>
+        <w:rPr>
+          <w:rFonts w:ascii="Consolas" w:eastAsia="Times New Roman" w:hAnsi="Consolas" w:cs="Times New Roman"/>
+          <w:color w:val="CE9178"/>
+          <w:sz w:val="21"/>
+          <w:szCs w:val="21"/>
+          <w:lang w:eastAsia="fr-FR"/>
+        </w:rPr>
+        <w:t xml:space="preserve"> VARCHAR(50) NOT NULL,</w:t>
+      </w:r>
+    </w:p>
+    <w:p>
+      <w:pPr>
+        <w:shd w:val="clear" w:color="auto" w:fill="000000"/>
+        <w:spacing w:after="0" w:line="285" w:lineRule="atLeast"/>
+        <w:rPr>
+          <w:rFonts w:ascii="Consolas" w:eastAsia="Times New Roman" w:hAnsi="Consolas" w:cs="Times New Roman"/>
+          <w:color w:val="CE9178"/>
+          <w:sz w:val="21"/>
+          <w:szCs w:val="21"/>
+          <w:lang w:eastAsia="fr-FR"/>
+        </w:rPr>
+      </w:pPr>
+      <w:r>
+        <w:rPr>
+          <w:rFonts w:ascii="Consolas" w:eastAsia="Times New Roman" w:hAnsi="Consolas" w:cs="Times New Roman"/>
+          <w:color w:val="CE9178"/>
+          <w:sz w:val="21"/>
+          <w:szCs w:val="21"/>
+          <w:lang w:eastAsia="fr-FR"/>
+        </w:rPr>
+        <w:tab/>
+      </w:r>
+      <w:proofErr w:type="gramStart"/>
+      <w:r>
+        <w:rPr>
+          <w:rFonts w:ascii="Consolas" w:eastAsia="Times New Roman" w:hAnsi="Consolas" w:cs="Times New Roman"/>
+          <w:color w:val="CE9178"/>
+          <w:sz w:val="21"/>
+          <w:szCs w:val="21"/>
+          <w:lang w:eastAsia="fr-FR"/>
+        </w:rPr>
+        <w:t>email</w:t>
+      </w:r>
+      <w:proofErr w:type="gramEnd"/>
+      <w:r>
+        <w:rPr>
+          <w:rFonts w:ascii="Consolas" w:eastAsia="Times New Roman" w:hAnsi="Consolas" w:cs="Times New Roman"/>
+          <w:color w:val="CE9178"/>
+          <w:sz w:val="21"/>
+          <w:szCs w:val="21"/>
+          <w:lang w:eastAsia="fr-FR"/>
+        </w:rPr>
+        <w:t xml:space="preserve"> VARCHAR(255) NOT NULL,</w:t>
+      </w:r>
+    </w:p>
+    <w:p>
+      <w:pPr>
+        <w:shd w:val="clear" w:color="auto" w:fill="000000"/>
+        <w:spacing w:after="0" w:line="285" w:lineRule="atLeast"/>
+        <w:rPr>
+          <w:rFonts w:ascii="Consolas" w:eastAsia="Times New Roman" w:hAnsi="Consolas" w:cs="Times New Roman"/>
+          <w:color w:val="CE9178"/>
+          <w:sz w:val="21"/>
+          <w:szCs w:val="21"/>
+          <w:lang w:eastAsia="fr-FR"/>
+        </w:rPr>
+      </w:pPr>
+      <w:r>
+        <w:rPr>
+          <w:rFonts w:ascii="Consolas" w:eastAsia="Times New Roman" w:hAnsi="Consolas" w:cs="Times New Roman"/>
+          <w:color w:val="CE9178"/>
+          <w:sz w:val="21"/>
+          <w:szCs w:val="21"/>
+          <w:lang w:eastAsia="fr-FR"/>
+        </w:rPr>
+        <w:tab/>
+      </w:r>
+      <w:proofErr w:type="spellStart"/>
+      <w:proofErr w:type="gramStart"/>
+      <w:r>
+        <w:rPr>
+          <w:rFonts w:ascii="Consolas" w:eastAsia="Times New Roman" w:hAnsi="Consolas" w:cs="Times New Roman"/>
+          <w:color w:val="CE9178"/>
+          <w:sz w:val="21"/>
+          <w:szCs w:val="21"/>
+          <w:lang w:eastAsia="fr-FR"/>
+        </w:rPr>
+        <w:t>mot</w:t>
+      </w:r>
+      <w:proofErr w:type="gramEnd"/>
+      <w:r>
+        <w:rPr>
+          <w:rFonts w:ascii="Consolas" w:eastAsia="Times New Roman" w:hAnsi="Consolas" w:cs="Times New Roman"/>
+          <w:color w:val="CE9178"/>
+          <w:sz w:val="21"/>
+          <w:szCs w:val="21"/>
+          <w:lang w:eastAsia="fr-FR"/>
+        </w:rPr>
+        <w:t>_de_passe</w:t>
+      </w:r>
+      <w:proofErr w:type="spellEnd"/>
+      <w:r>
+        <w:rPr>
+          <w:rFonts w:ascii="Consolas" w:eastAsia="Times New Roman" w:hAnsi="Consolas" w:cs="Times New Roman"/>
+          <w:color w:val="CE9178"/>
+          <w:sz w:val="21"/>
+          <w:szCs w:val="21"/>
+          <w:lang w:eastAsia="fr-FR"/>
+        </w:rPr>
+        <w:t xml:space="preserve"> VARCHAR(255) NOT NULL,</w:t>
+      </w:r>
+    </w:p>
+    <w:p>
+      <w:pPr>
+        <w:shd w:val="clear" w:color="auto" w:fill="000000"/>
+        <w:spacing w:after="0" w:line="285" w:lineRule="atLeast"/>
+        <w:rPr>
+          <w:rFonts w:ascii="Consolas" w:eastAsia="Times New Roman" w:hAnsi="Consolas" w:cs="Times New Roman"/>
+          <w:color w:val="CE9178"/>
+          <w:sz w:val="21"/>
+          <w:szCs w:val="21"/>
+          <w:lang w:eastAsia="fr-FR"/>
+        </w:rPr>
+      </w:pPr>
+      <w:r>
+        <w:rPr>
+          <w:rFonts w:ascii="Consolas" w:eastAsia="Times New Roman" w:hAnsi="Consolas" w:cs="Times New Roman"/>
+          <w:color w:val="CE9178"/>
+          <w:sz w:val="21"/>
+          <w:szCs w:val="21"/>
+          <w:lang w:eastAsia="fr-FR"/>
+        </w:rPr>
+        <w:tab/>
+      </w:r>
+      <w:proofErr w:type="spellStart"/>
+      <w:proofErr w:type="gramStart"/>
+      <w:r>
+        <w:rPr>
+          <w:rFonts w:ascii="Consolas" w:eastAsia="Times New Roman" w:hAnsi="Consolas" w:cs="Times New Roman"/>
+          <w:color w:val="CE9178"/>
+          <w:sz w:val="21"/>
+          <w:szCs w:val="21"/>
+          <w:lang w:eastAsia="fr-FR"/>
+        </w:rPr>
+        <w:t>photo</w:t>
+      </w:r>
+      <w:proofErr w:type="gramEnd"/>
+      <w:r>
+        <w:rPr>
+          <w:rFonts w:ascii="Consolas" w:eastAsia="Times New Roman" w:hAnsi="Consolas" w:cs="Times New Roman"/>
+          <w:color w:val="CE9178"/>
+          <w:sz w:val="21"/>
+          <w:szCs w:val="21"/>
+          <w:lang w:eastAsia="fr-FR"/>
+        </w:rPr>
+        <w:t>_profil</w:t>
+      </w:r>
+      <w:proofErr w:type="spellEnd"/>
+      <w:r>
+        <w:rPr>
+          <w:rFonts w:ascii="Consolas" w:eastAsia="Times New Roman" w:hAnsi="Consolas" w:cs="Times New Roman"/>
+          <w:color w:val="CE9178"/>
+          <w:sz w:val="21"/>
+          <w:szCs w:val="21"/>
+          <w:lang w:eastAsia="fr-FR"/>
+        </w:rPr>
+        <w:t xml:space="preserve"> VARCHAR(255) NULL,</w:t>
+      </w:r>
+    </w:p>
+    <w:p>
+      <w:pPr>
+        <w:shd w:val="clear" w:color="auto" w:fill="000000"/>
+        <w:spacing w:after="0" w:line="285" w:lineRule="atLeast"/>
+        <w:rPr>
+          <w:rFonts w:ascii="Consolas" w:eastAsia="Times New Roman" w:hAnsi="Consolas" w:cs="Times New Roman"/>
+          <w:color w:val="CE9178"/>
+          <w:sz w:val="21"/>
+          <w:szCs w:val="21"/>
+          <w:lang w:eastAsia="fr-FR"/>
+        </w:rPr>
+      </w:pPr>
+      <w:r>
+        <w:rPr>
+          <w:rFonts w:ascii="Consolas" w:eastAsia="Times New Roman" w:hAnsi="Consolas" w:cs="Times New Roman"/>
+          <w:color w:val="CE9178"/>
+          <w:sz w:val="21"/>
+          <w:szCs w:val="21"/>
+          <w:lang w:eastAsia="fr-FR"/>
+        </w:rPr>
+        <w:tab/>
+        <w:t xml:space="preserve">CONSTRAINT </w:t>
+      </w:r>
+      <w:proofErr w:type="spellStart"/>
+      <w:r>
+        <w:rPr>
+          <w:rFonts w:ascii="Consolas" w:eastAsia="Times New Roman" w:hAnsi="Consolas" w:cs="Times New Roman"/>
+          <w:color w:val="CE9178"/>
+          <w:sz w:val="21"/>
+          <w:szCs w:val="21"/>
+          <w:lang w:eastAsia="fr-FR"/>
+        </w:rPr>
+        <w:t>email_unique</w:t>
+      </w:r>
+      <w:proofErr w:type="spellEnd"/>
+      <w:r>
+        <w:rPr>
+          <w:rFonts w:ascii="Consolas" w:eastAsia="Times New Roman" w:hAnsi="Consolas" w:cs="Times New Roman"/>
+          <w:color w:val="CE9178"/>
+          <w:sz w:val="21"/>
+          <w:szCs w:val="21"/>
+          <w:lang w:eastAsia="fr-FR"/>
+        </w:rPr>
+        <w:t xml:space="preserve"> UNIQUE (email)</w:t>
+      </w:r>
+    </w:p>
+    <w:p>
+      <w:pPr>
+        <w:shd w:val="clear" w:color="auto" w:fill="000000"/>
+        <w:spacing w:after="0" w:line="285" w:lineRule="atLeast"/>
+        <w:rPr>
+          <w:rFonts w:ascii="Consolas" w:eastAsia="Times New Roman" w:hAnsi="Consolas" w:cs="Times New Roman"/>
+          <w:color w:val="CE9178"/>
+          <w:sz w:val="21"/>
+          <w:szCs w:val="21"/>
+          <w:lang w:eastAsia="fr-FR"/>
+        </w:rPr>
+      </w:pPr>
+      <w:r>
+        <w:rPr>
+          <w:rFonts w:ascii="Consolas" w:eastAsia="Times New Roman" w:hAnsi="Consolas" w:cs="Times New Roman"/>
+          <w:color w:val="CE9178"/>
+          <w:sz w:val="21"/>
+          <w:szCs w:val="21"/>
+          <w:lang w:eastAsia="fr-FR"/>
+        </w:rPr>
+        <w:t>);</w:t>
+      </w:r>
+    </w:p>
+    <w:p>
+      <w:pPr>
+        <w:shd w:val="clear" w:color="auto" w:fill="000000"/>
+        <w:spacing w:after="0" w:line="285" w:lineRule="atLeast"/>
+        <w:rPr>
+          <w:rFonts w:ascii="Consolas" w:eastAsia="Times New Roman" w:hAnsi="Consolas" w:cs="Times New Roman"/>
+          <w:color w:val="CE9178"/>
+          <w:sz w:val="21"/>
+          <w:szCs w:val="21"/>
+          <w:lang w:eastAsia="fr-FR"/>
+        </w:rPr>
+      </w:pPr>
+    </w:p>
+    <w:p>
+      <w:pPr>
+        <w:shd w:val="clear" w:color="auto" w:fill="000000"/>
+        <w:spacing w:after="0" w:line="285" w:lineRule="atLeast"/>
+        <w:rPr>
+          <w:rFonts w:ascii="Consolas" w:eastAsia="Times New Roman" w:hAnsi="Consolas" w:cs="Times New Roman"/>
+          <w:color w:val="CE9178"/>
+          <w:sz w:val="21"/>
+          <w:szCs w:val="21"/>
+          <w:lang w:eastAsia="fr-FR"/>
+        </w:rPr>
+      </w:pPr>
+      <w:r>
+        <w:rPr>
+          <w:rFonts w:ascii="Consolas" w:eastAsia="Times New Roman" w:hAnsi="Consolas" w:cs="Times New Roman"/>
+          <w:color w:val="CE9178"/>
+          <w:sz w:val="21"/>
+          <w:szCs w:val="21"/>
+          <w:lang w:eastAsia="fr-FR"/>
+        </w:rPr>
+        <w:t>ALTER TABLE utilisateur,</w:t>
+      </w:r>
+    </w:p>
+    <w:p>
+      <w:pPr>
+        <w:shd w:val="clear" w:color="auto" w:fill="000000"/>
+        <w:spacing w:after="0" w:line="285" w:lineRule="atLeast"/>
+        <w:rPr>
+          <w:rFonts w:ascii="Consolas" w:eastAsia="Times New Roman" w:hAnsi="Consolas" w:cs="Times New Roman"/>
+          <w:color w:val="CE9178"/>
+          <w:sz w:val="21"/>
+          <w:szCs w:val="21"/>
+          <w:lang w:eastAsia="fr-FR"/>
+        </w:rPr>
+      </w:pPr>
+      <w:r>
+        <w:rPr>
+          <w:rFonts w:ascii="Consolas" w:eastAsia="Times New Roman" w:hAnsi="Consolas" w:cs="Times New Roman"/>
+          <w:color w:val="CE9178"/>
+          <w:sz w:val="21"/>
+          <w:szCs w:val="21"/>
+          <w:lang w:eastAsia="fr-FR"/>
+        </w:rPr>
+        <w:t xml:space="preserve">CONSTRAINT </w:t>
+      </w:r>
+      <w:proofErr w:type="spellStart"/>
+      <w:r>
+        <w:rPr>
+          <w:rFonts w:ascii="Consolas" w:eastAsia="Times New Roman" w:hAnsi="Consolas" w:cs="Times New Roman"/>
+          <w:color w:val="CE9178"/>
+          <w:sz w:val="21"/>
+          <w:szCs w:val="21"/>
+          <w:lang w:eastAsia="fr-FR"/>
+        </w:rPr>
+        <w:t>pseudo_unique</w:t>
+      </w:r>
+      <w:proofErr w:type="spellEnd"/>
+      <w:r>
+        <w:rPr>
+          <w:rFonts w:ascii="Consolas" w:eastAsia="Times New Roman" w:hAnsi="Consolas" w:cs="Times New Roman"/>
+          <w:color w:val="CE9178"/>
+          <w:sz w:val="21"/>
+          <w:szCs w:val="21"/>
+          <w:lang w:eastAsia="fr-FR"/>
+        </w:rPr>
+        <w:t xml:space="preserve"> UNIQUE (pseudo) </w:t>
+      </w:r>
+      <w:r>
+        <w:rPr>
+          <w:rFonts w:ascii="Consolas" w:eastAsia="Times New Roman" w:hAnsi="Consolas" w:cs="Times New Roman"/>
+          <w:color w:val="70AD47" w:themeColor="accent6"/>
+          <w:sz w:val="21"/>
+          <w:szCs w:val="21"/>
+          <w:lang w:eastAsia="fr-FR"/>
+        </w:rPr>
+        <w:t>//pour modifier le tableau</w:t>
+      </w:r>
+    </w:p>
+    <w:p>
+      <w:pPr>
+        <w:shd w:val="clear" w:color="auto" w:fill="000000"/>
+        <w:spacing w:after="0" w:line="285" w:lineRule="atLeast"/>
+        <w:rPr>
+          <w:rFonts w:ascii="Consolas" w:eastAsia="Times New Roman" w:hAnsi="Consolas" w:cs="Times New Roman"/>
+          <w:color w:val="CE9178"/>
+          <w:sz w:val="21"/>
+          <w:szCs w:val="21"/>
+          <w:lang w:eastAsia="fr-FR"/>
+        </w:rPr>
+      </w:pPr>
+    </w:p>
+    <w:p>
+      <w:pPr>
+        <w:shd w:val="clear" w:color="auto" w:fill="000000"/>
+        <w:spacing w:after="0" w:line="285" w:lineRule="atLeast"/>
+        <w:rPr>
+          <w:rFonts w:ascii="Consolas" w:eastAsia="Times New Roman" w:hAnsi="Consolas" w:cs="Times New Roman"/>
+          <w:color w:val="CE9178"/>
+          <w:sz w:val="21"/>
+          <w:szCs w:val="21"/>
+          <w:lang w:eastAsia="fr-FR"/>
+        </w:rPr>
+      </w:pPr>
+      <w:r>
+        <w:rPr>
+          <w:rFonts w:ascii="Consolas" w:eastAsia="Times New Roman" w:hAnsi="Consolas" w:cs="Times New Roman"/>
+          <w:color w:val="CE9178"/>
+          <w:sz w:val="21"/>
+          <w:szCs w:val="21"/>
+          <w:lang w:eastAsia="fr-FR"/>
+        </w:rPr>
+        <w:t xml:space="preserve">CREATE TABLE </w:t>
+      </w:r>
+      <w:proofErr w:type="gramStart"/>
+      <w:r>
+        <w:rPr>
+          <w:rFonts w:ascii="Consolas" w:eastAsia="Times New Roman" w:hAnsi="Consolas" w:cs="Times New Roman"/>
+          <w:color w:val="CE9178"/>
+          <w:sz w:val="21"/>
+          <w:szCs w:val="21"/>
+          <w:lang w:eastAsia="fr-FR"/>
+        </w:rPr>
+        <w:t>livre(</w:t>
+      </w:r>
+      <w:proofErr w:type="gramEnd"/>
+    </w:p>
+    <w:p>
+      <w:pPr>
+        <w:shd w:val="clear" w:color="auto" w:fill="000000"/>
+        <w:spacing w:after="0" w:line="285" w:lineRule="atLeast"/>
+        <w:rPr>
+          <w:rFonts w:ascii="Consolas" w:eastAsia="Times New Roman" w:hAnsi="Consolas" w:cs="Times New Roman"/>
+          <w:color w:val="CE9178"/>
+          <w:sz w:val="21"/>
+          <w:szCs w:val="21"/>
+          <w:lang w:eastAsia="fr-FR"/>
+        </w:rPr>
+      </w:pPr>
+      <w:r>
+        <w:rPr>
+          <w:rFonts w:ascii="Consolas" w:eastAsia="Times New Roman" w:hAnsi="Consolas" w:cs="Times New Roman"/>
+          <w:color w:val="CE9178"/>
+          <w:sz w:val="21"/>
+          <w:szCs w:val="21"/>
+          <w:lang w:eastAsia="fr-FR"/>
+        </w:rPr>
+        <w:tab/>
+      </w:r>
+      <w:proofErr w:type="spellStart"/>
+      <w:proofErr w:type="gramStart"/>
+      <w:r>
+        <w:rPr>
+          <w:rFonts w:ascii="Consolas" w:eastAsia="Times New Roman" w:hAnsi="Consolas" w:cs="Times New Roman"/>
+          <w:color w:val="CE9178"/>
+          <w:sz w:val="21"/>
+          <w:szCs w:val="21"/>
+          <w:lang w:eastAsia="fr-FR"/>
+        </w:rPr>
+        <w:t>isbn</w:t>
+      </w:r>
+      <w:proofErr w:type="spellEnd"/>
+      <w:proofErr w:type="gramEnd"/>
+      <w:r>
+        <w:rPr>
+          <w:rFonts w:ascii="Consolas" w:eastAsia="Times New Roman" w:hAnsi="Consolas" w:cs="Times New Roman"/>
+          <w:color w:val="CE9178"/>
+          <w:sz w:val="21"/>
+          <w:szCs w:val="21"/>
+          <w:lang w:eastAsia="fr-FR"/>
+        </w:rPr>
+        <w:t xml:space="preserve"> CHAR(13) PRIMARY KEY,</w:t>
+      </w:r>
+    </w:p>
+    <w:p>
+      <w:pPr>
+        <w:shd w:val="clear" w:color="auto" w:fill="000000"/>
+        <w:spacing w:after="0" w:line="285" w:lineRule="atLeast"/>
+        <w:rPr>
+          <w:rFonts w:ascii="Consolas" w:eastAsia="Times New Roman" w:hAnsi="Consolas" w:cs="Times New Roman"/>
+          <w:color w:val="CE9178"/>
+          <w:sz w:val="21"/>
+          <w:szCs w:val="21"/>
+          <w:lang w:eastAsia="fr-FR"/>
+        </w:rPr>
+      </w:pPr>
+      <w:r>
+        <w:rPr>
+          <w:rFonts w:ascii="Consolas" w:eastAsia="Times New Roman" w:hAnsi="Consolas" w:cs="Times New Roman"/>
+          <w:color w:val="CE9178"/>
+          <w:sz w:val="21"/>
+          <w:szCs w:val="21"/>
+          <w:lang w:eastAsia="fr-FR"/>
+        </w:rPr>
+        <w:tab/>
+        <w:t>titre VARCHAR(255) NOT NULL,</w:t>
+      </w:r>
+    </w:p>
+    <w:p>
+      <w:pPr>
+        <w:shd w:val="clear" w:color="auto" w:fill="000000"/>
+        <w:spacing w:after="0" w:line="285" w:lineRule="atLeast"/>
+        <w:rPr>
+          <w:rFonts w:ascii="Consolas" w:eastAsia="Times New Roman" w:hAnsi="Consolas" w:cs="Times New Roman"/>
+          <w:color w:val="CE9178"/>
+          <w:sz w:val="21"/>
+          <w:szCs w:val="21"/>
+          <w:lang w:eastAsia="fr-FR"/>
+        </w:rPr>
+      </w:pPr>
+      <w:r>
+        <w:rPr>
+          <w:rFonts w:ascii="Consolas" w:eastAsia="Times New Roman" w:hAnsi="Consolas" w:cs="Times New Roman"/>
+          <w:color w:val="CE9178"/>
+          <w:sz w:val="21"/>
+          <w:szCs w:val="21"/>
+          <w:lang w:eastAsia="fr-FR"/>
+        </w:rPr>
+        <w:tab/>
+        <w:t>auteur VARCHAR(255) NOT NULL,</w:t>
+      </w:r>
+    </w:p>
+    <w:p>
+      <w:pPr>
+        <w:shd w:val="clear" w:color="auto" w:fill="000000"/>
+        <w:spacing w:after="0" w:line="285" w:lineRule="atLeast"/>
+        <w:rPr>
+          <w:rFonts w:ascii="Consolas" w:eastAsia="Times New Roman" w:hAnsi="Consolas" w:cs="Times New Roman"/>
+          <w:color w:val="CE9178"/>
+          <w:sz w:val="21"/>
+          <w:szCs w:val="21"/>
+          <w:lang w:eastAsia="fr-FR"/>
+        </w:rPr>
+      </w:pPr>
+      <w:r>
+        <w:rPr>
+          <w:rFonts w:ascii="Consolas" w:eastAsia="Times New Roman" w:hAnsi="Consolas" w:cs="Times New Roman"/>
+          <w:color w:val="CE9178"/>
+          <w:sz w:val="21"/>
+          <w:szCs w:val="21"/>
+          <w:lang w:eastAsia="fr-FR"/>
+        </w:rPr>
+        <w:tab/>
+      </w:r>
+      <w:proofErr w:type="spellStart"/>
+      <w:r>
+        <w:rPr>
+          <w:rFonts w:ascii="Consolas" w:eastAsia="Times New Roman" w:hAnsi="Consolas" w:cs="Times New Roman"/>
+          <w:color w:val="CE9178"/>
+          <w:sz w:val="21"/>
+          <w:szCs w:val="21"/>
+          <w:lang w:eastAsia="fr-FR"/>
+        </w:rPr>
+        <w:t>resume</w:t>
+      </w:r>
+      <w:proofErr w:type="spellEnd"/>
+      <w:r>
+        <w:rPr>
+          <w:rFonts w:ascii="Consolas" w:eastAsia="Times New Roman" w:hAnsi="Consolas" w:cs="Times New Roman"/>
+          <w:color w:val="CE9178"/>
+          <w:sz w:val="21"/>
+          <w:szCs w:val="21"/>
+          <w:lang w:eastAsia="fr-FR"/>
+        </w:rPr>
+        <w:t xml:space="preserve"> TEXT NULL,</w:t>
+      </w:r>
+    </w:p>
+    <w:p>
+      <w:pPr>
+        <w:shd w:val="clear" w:color="auto" w:fill="000000"/>
+        <w:spacing w:after="0" w:line="285" w:lineRule="atLeast"/>
+        <w:rPr>
+          <w:rFonts w:ascii="Consolas" w:eastAsia="Times New Roman" w:hAnsi="Consolas" w:cs="Times New Roman"/>
+          <w:color w:val="CE9178"/>
+          <w:sz w:val="21"/>
+          <w:szCs w:val="21"/>
+          <w:lang w:eastAsia="fr-FR"/>
+        </w:rPr>
+      </w:pPr>
+      <w:r>
+        <w:rPr>
+          <w:rFonts w:ascii="Consolas" w:eastAsia="Times New Roman" w:hAnsi="Consolas" w:cs="Times New Roman"/>
+          <w:color w:val="CE9178"/>
+          <w:sz w:val="21"/>
+          <w:szCs w:val="21"/>
+          <w:lang w:eastAsia="fr-FR"/>
+        </w:rPr>
+        <w:tab/>
+      </w:r>
+      <w:proofErr w:type="spellStart"/>
+      <w:r>
+        <w:rPr>
+          <w:rFonts w:ascii="Consolas" w:eastAsia="Times New Roman" w:hAnsi="Consolas" w:cs="Times New Roman"/>
+          <w:color w:val="CE9178"/>
+          <w:sz w:val="21"/>
+          <w:szCs w:val="21"/>
+          <w:lang w:eastAsia="fr-FR"/>
+        </w:rPr>
+        <w:t>url_couverture</w:t>
+      </w:r>
+      <w:proofErr w:type="spellEnd"/>
+      <w:r>
+        <w:rPr>
+          <w:rFonts w:ascii="Consolas" w:eastAsia="Times New Roman" w:hAnsi="Consolas" w:cs="Times New Roman"/>
+          <w:color w:val="CE9178"/>
+          <w:sz w:val="21"/>
+          <w:szCs w:val="21"/>
+          <w:lang w:eastAsia="fr-FR"/>
+        </w:rPr>
+        <w:t xml:space="preserve"> VARCHAR(255) NULL</w:t>
+      </w:r>
+    </w:p>
+    <w:p>
+      <w:pPr>
+        <w:shd w:val="clear" w:color="auto" w:fill="000000"/>
+        <w:spacing w:after="0" w:line="285" w:lineRule="atLeast"/>
+        <w:rPr>
+          <w:rFonts w:ascii="Consolas" w:eastAsia="Times New Roman" w:hAnsi="Consolas" w:cs="Times New Roman"/>
+          <w:color w:val="CE9178"/>
+          <w:sz w:val="21"/>
+          <w:szCs w:val="21"/>
+          <w:lang w:eastAsia="fr-FR"/>
+        </w:rPr>
+      </w:pPr>
+      <w:r>
+        <w:rPr>
+          <w:rFonts w:ascii="Consolas" w:eastAsia="Times New Roman" w:hAnsi="Consolas" w:cs="Times New Roman"/>
+          <w:color w:val="CE9178"/>
+          <w:sz w:val="21"/>
+          <w:szCs w:val="21"/>
+          <w:lang w:eastAsia="fr-FR"/>
+        </w:rPr>
+        <w:t>);</w:t>
+      </w:r>
+    </w:p>
+    <w:p>
+      <w:pPr>
+        <w:shd w:val="clear" w:color="auto" w:fill="000000"/>
+        <w:spacing w:after="0" w:line="285" w:lineRule="atLeast"/>
+        <w:rPr>
+          <w:rFonts w:ascii="Consolas" w:eastAsia="Times New Roman" w:hAnsi="Consolas" w:cs="Times New Roman"/>
+          <w:color w:val="CE9178"/>
+          <w:sz w:val="21"/>
+          <w:szCs w:val="21"/>
+          <w:lang w:eastAsia="fr-FR"/>
+        </w:rPr>
+      </w:pPr>
+    </w:p>
+    <w:p>
+      <w:pPr>
+        <w:shd w:val="clear" w:color="auto" w:fill="000000"/>
+        <w:spacing w:after="0" w:line="285" w:lineRule="atLeast"/>
+        <w:rPr>
+          <w:rFonts w:ascii="Consolas" w:eastAsia="Times New Roman" w:hAnsi="Consolas" w:cs="Times New Roman"/>
+          <w:color w:val="CE9178"/>
+          <w:sz w:val="21"/>
+          <w:szCs w:val="21"/>
+          <w:lang w:eastAsia="fr-FR"/>
+        </w:rPr>
+      </w:pPr>
+      <w:r>
+        <w:rPr>
+          <w:rFonts w:ascii="Consolas" w:eastAsia="Times New Roman" w:hAnsi="Consolas" w:cs="Times New Roman"/>
+          <w:color w:val="CE9178"/>
+          <w:sz w:val="21"/>
+          <w:szCs w:val="21"/>
+          <w:lang w:eastAsia="fr-FR"/>
+        </w:rPr>
+        <w:t>CREATE TABLE exemplaire(</w:t>
+      </w:r>
+    </w:p>
+    <w:p>
+      <w:pPr>
+        <w:shd w:val="clear" w:color="auto" w:fill="000000"/>
+        <w:spacing w:after="0" w:line="285" w:lineRule="atLeast"/>
+        <w:rPr>
+          <w:rFonts w:ascii="Consolas" w:eastAsia="Times New Roman" w:hAnsi="Consolas" w:cs="Times New Roman"/>
+          <w:color w:val="CE9178"/>
+          <w:sz w:val="21"/>
+          <w:szCs w:val="21"/>
+          <w:lang w:eastAsia="fr-FR"/>
+        </w:rPr>
+      </w:pPr>
+      <w:r>
+        <w:rPr>
+          <w:rFonts w:ascii="Consolas" w:eastAsia="Times New Roman" w:hAnsi="Consolas" w:cs="Times New Roman"/>
+          <w:color w:val="CE9178"/>
+          <w:sz w:val="21"/>
+          <w:szCs w:val="21"/>
+          <w:lang w:eastAsia="fr-FR"/>
+        </w:rPr>
+        <w:tab/>
+      </w:r>
+      <w:proofErr w:type="spellStart"/>
+      <w:r>
+        <w:rPr>
+          <w:rFonts w:ascii="Consolas" w:eastAsia="Times New Roman" w:hAnsi="Consolas" w:cs="Times New Roman"/>
+          <w:color w:val="CE9178"/>
+          <w:sz w:val="21"/>
+          <w:szCs w:val="21"/>
+          <w:lang w:eastAsia="fr-FR"/>
+        </w:rPr>
+        <w:t>id_exemplaire</w:t>
+      </w:r>
+      <w:proofErr w:type="spellEnd"/>
+      <w:r>
+        <w:rPr>
+          <w:rFonts w:ascii="Consolas" w:eastAsia="Times New Roman" w:hAnsi="Consolas" w:cs="Times New Roman"/>
+          <w:color w:val="CE9178"/>
+          <w:sz w:val="21"/>
+          <w:szCs w:val="21"/>
+          <w:lang w:eastAsia="fr-FR"/>
+        </w:rPr>
+        <w:t xml:space="preserve"> INT PRIMARY KEY AUTO_INCREMENT,</w:t>
+      </w:r>
+    </w:p>
+    <w:p>
+      <w:pPr>
+        <w:shd w:val="clear" w:color="auto" w:fill="000000"/>
+        <w:spacing w:after="0" w:line="285" w:lineRule="atLeast"/>
+        <w:rPr>
+          <w:rFonts w:ascii="Consolas" w:eastAsia="Times New Roman" w:hAnsi="Consolas" w:cs="Times New Roman"/>
+          <w:color w:val="CE9178"/>
+          <w:sz w:val="21"/>
+          <w:szCs w:val="21"/>
+          <w:lang w:eastAsia="fr-FR"/>
+        </w:rPr>
+      </w:pPr>
+      <w:r>
+        <w:rPr>
+          <w:rFonts w:ascii="Consolas" w:eastAsia="Times New Roman" w:hAnsi="Consolas" w:cs="Times New Roman"/>
+          <w:color w:val="CE9178"/>
+          <w:sz w:val="21"/>
+          <w:szCs w:val="21"/>
+          <w:lang w:eastAsia="fr-FR"/>
+        </w:rPr>
+        <w:lastRenderedPageBreak/>
+        <w:tab/>
+        <w:t>disponible BOOLEAN DEFAULT TRUE,</w:t>
+      </w:r>
+    </w:p>
+    <w:p>
+      <w:pPr>
+        <w:shd w:val="clear" w:color="auto" w:fill="000000"/>
+        <w:spacing w:after="0" w:line="285" w:lineRule="atLeast"/>
+        <w:rPr>
+          <w:rFonts w:ascii="Consolas" w:eastAsia="Times New Roman" w:hAnsi="Consolas" w:cs="Times New Roman"/>
+          <w:color w:val="CE9178"/>
+          <w:sz w:val="21"/>
+          <w:szCs w:val="21"/>
+          <w:lang w:eastAsia="fr-FR"/>
+        </w:rPr>
+      </w:pPr>
+      <w:r>
+        <w:rPr>
+          <w:rFonts w:ascii="Consolas" w:eastAsia="Times New Roman" w:hAnsi="Consolas" w:cs="Times New Roman"/>
+          <w:color w:val="CE9178"/>
+          <w:sz w:val="21"/>
+          <w:szCs w:val="21"/>
+          <w:lang w:eastAsia="fr-FR"/>
+        </w:rPr>
+        <w:tab/>
+      </w:r>
+      <w:proofErr w:type="spellStart"/>
+      <w:r>
+        <w:rPr>
+          <w:rFonts w:ascii="Consolas" w:eastAsia="Times New Roman" w:hAnsi="Consolas" w:cs="Times New Roman"/>
+          <w:color w:val="CE9178"/>
+          <w:sz w:val="21"/>
+          <w:szCs w:val="21"/>
+          <w:lang w:eastAsia="fr-FR"/>
+        </w:rPr>
+        <w:t>date_ajout</w:t>
+      </w:r>
+      <w:proofErr w:type="spellEnd"/>
+      <w:r>
+        <w:rPr>
+          <w:rFonts w:ascii="Consolas" w:eastAsia="Times New Roman" w:hAnsi="Consolas" w:cs="Times New Roman"/>
+          <w:color w:val="CE9178"/>
+          <w:sz w:val="21"/>
+          <w:szCs w:val="21"/>
+          <w:lang w:eastAsia="fr-FR"/>
+        </w:rPr>
+        <w:t xml:space="preserve"> DATETIME DEFAULT CURRENT_TIMESTAMP,</w:t>
+      </w:r>
+    </w:p>
+    <w:p>
+      <w:pPr>
+        <w:shd w:val="clear" w:color="auto" w:fill="000000"/>
+        <w:spacing w:after="0" w:line="285" w:lineRule="atLeast"/>
+        <w:rPr>
+          <w:rFonts w:ascii="Consolas" w:eastAsia="Times New Roman" w:hAnsi="Consolas" w:cs="Times New Roman"/>
+          <w:color w:val="CE9178"/>
+          <w:sz w:val="21"/>
+          <w:szCs w:val="21"/>
+          <w:lang w:eastAsia="fr-FR"/>
+        </w:rPr>
+      </w:pPr>
+      <w:r>
+        <w:rPr>
+          <w:rFonts w:ascii="Consolas" w:eastAsia="Times New Roman" w:hAnsi="Consolas" w:cs="Times New Roman"/>
+          <w:color w:val="CE9178"/>
+          <w:sz w:val="21"/>
+          <w:szCs w:val="21"/>
+          <w:lang w:eastAsia="fr-FR"/>
+        </w:rPr>
+        <w:tab/>
+        <w:t>commentaire TEXT NULL,</w:t>
+      </w:r>
+    </w:p>
+    <w:p>
+      <w:pPr>
+        <w:shd w:val="clear" w:color="auto" w:fill="000000"/>
+        <w:spacing w:after="0" w:line="285" w:lineRule="atLeast"/>
+        <w:rPr>
+          <w:rFonts w:ascii="Consolas" w:eastAsia="Times New Roman" w:hAnsi="Consolas" w:cs="Times New Roman"/>
+          <w:color w:val="CE9178"/>
+          <w:sz w:val="21"/>
+          <w:szCs w:val="21"/>
+          <w:lang w:eastAsia="fr-FR"/>
+        </w:rPr>
+      </w:pPr>
+      <w:r>
+        <w:rPr>
+          <w:rFonts w:ascii="Consolas" w:eastAsia="Times New Roman" w:hAnsi="Consolas" w:cs="Times New Roman"/>
+          <w:color w:val="CE9178"/>
+          <w:sz w:val="21"/>
+          <w:szCs w:val="21"/>
+          <w:lang w:eastAsia="fr-FR"/>
+        </w:rPr>
+        <w:tab/>
+      </w:r>
+      <w:proofErr w:type="spellStart"/>
+      <w:r>
+        <w:rPr>
+          <w:rFonts w:ascii="Consolas" w:eastAsia="Times New Roman" w:hAnsi="Consolas" w:cs="Times New Roman"/>
+          <w:color w:val="CE9178"/>
+          <w:sz w:val="21"/>
+          <w:szCs w:val="21"/>
+          <w:lang w:eastAsia="fr-FR"/>
+        </w:rPr>
+        <w:t>isbn</w:t>
+      </w:r>
+      <w:proofErr w:type="spellEnd"/>
+      <w:r>
+        <w:rPr>
+          <w:rFonts w:ascii="Consolas" w:eastAsia="Times New Roman" w:hAnsi="Consolas" w:cs="Times New Roman"/>
+          <w:color w:val="CE9178"/>
+          <w:sz w:val="21"/>
+          <w:szCs w:val="21"/>
+          <w:lang w:eastAsia="fr-FR"/>
+        </w:rPr>
+        <w:t xml:space="preserve"> CHAR(13) NOT NULL,</w:t>
+      </w:r>
+    </w:p>
+    <w:p>
+      <w:pPr>
+        <w:shd w:val="clear" w:color="auto" w:fill="000000"/>
+        <w:spacing w:after="0" w:line="285" w:lineRule="atLeast"/>
+        <w:rPr>
+          <w:rFonts w:ascii="Consolas" w:eastAsia="Times New Roman" w:hAnsi="Consolas" w:cs="Times New Roman"/>
+          <w:color w:val="CE9178"/>
+          <w:sz w:val="21"/>
+          <w:szCs w:val="21"/>
+          <w:lang w:eastAsia="fr-FR"/>
+        </w:rPr>
+      </w:pPr>
+      <w:r>
+        <w:rPr>
+          <w:rFonts w:ascii="Consolas" w:eastAsia="Times New Roman" w:hAnsi="Consolas" w:cs="Times New Roman"/>
+          <w:color w:val="CE9178"/>
+          <w:sz w:val="21"/>
+          <w:szCs w:val="21"/>
+          <w:lang w:eastAsia="fr-FR"/>
+        </w:rPr>
+        <w:tab/>
+      </w:r>
+      <w:proofErr w:type="spellStart"/>
+      <w:r>
+        <w:rPr>
+          <w:rFonts w:ascii="Consolas" w:eastAsia="Times New Roman" w:hAnsi="Consolas" w:cs="Times New Roman"/>
+          <w:color w:val="CE9178"/>
+          <w:sz w:val="21"/>
+          <w:szCs w:val="21"/>
+          <w:lang w:eastAsia="fr-FR"/>
+        </w:rPr>
+        <w:t>id_proprietaire</w:t>
+      </w:r>
+      <w:proofErr w:type="spellEnd"/>
+      <w:r>
+        <w:rPr>
+          <w:rFonts w:ascii="Consolas" w:eastAsia="Times New Roman" w:hAnsi="Consolas" w:cs="Times New Roman"/>
+          <w:color w:val="CE9178"/>
+          <w:sz w:val="21"/>
+          <w:szCs w:val="21"/>
+          <w:lang w:eastAsia="fr-FR"/>
+        </w:rPr>
+        <w:t xml:space="preserve"> INT NOT NULL,</w:t>
+      </w:r>
+    </w:p>
+    <w:p>
+      <w:pPr>
+        <w:shd w:val="clear" w:color="auto" w:fill="000000"/>
+        <w:spacing w:after="0" w:line="285" w:lineRule="atLeast"/>
+        <w:rPr>
+          <w:rFonts w:ascii="Consolas" w:eastAsia="Times New Roman" w:hAnsi="Consolas" w:cs="Times New Roman"/>
+          <w:color w:val="CE9178"/>
+          <w:sz w:val="21"/>
+          <w:szCs w:val="21"/>
+          <w:lang w:eastAsia="fr-FR"/>
+        </w:rPr>
+      </w:pPr>
+      <w:r>
+        <w:rPr>
+          <w:rFonts w:ascii="Consolas" w:eastAsia="Times New Roman" w:hAnsi="Consolas" w:cs="Times New Roman"/>
+          <w:color w:val="CE9178"/>
+          <w:sz w:val="21"/>
+          <w:szCs w:val="21"/>
+          <w:lang w:eastAsia="fr-FR"/>
+        </w:rPr>
+        <w:tab/>
+        <w:t xml:space="preserve">CONSTRAINT </w:t>
+      </w:r>
+      <w:proofErr w:type="spellStart"/>
+      <w:r>
+        <w:rPr>
+          <w:rFonts w:ascii="Consolas" w:eastAsia="Times New Roman" w:hAnsi="Consolas" w:cs="Times New Roman"/>
+          <w:color w:val="CE9178"/>
+          <w:sz w:val="21"/>
+          <w:szCs w:val="21"/>
+          <w:lang w:eastAsia="fr-FR"/>
+        </w:rPr>
+        <w:t>fk_exemplaire_livre</w:t>
+      </w:r>
+      <w:proofErr w:type="spellEnd"/>
+      <w:r>
+        <w:rPr>
+          <w:rFonts w:ascii="Consolas" w:eastAsia="Times New Roman" w:hAnsi="Consolas" w:cs="Times New Roman"/>
+          <w:color w:val="CE9178"/>
+          <w:sz w:val="21"/>
+          <w:szCs w:val="21"/>
+          <w:lang w:eastAsia="fr-FR"/>
+        </w:rPr>
+        <w:t xml:space="preserve"> FOREIGN KEY (</w:t>
+      </w:r>
+      <w:proofErr w:type="spellStart"/>
+      <w:r>
+        <w:rPr>
+          <w:rFonts w:ascii="Consolas" w:eastAsia="Times New Roman" w:hAnsi="Consolas" w:cs="Times New Roman"/>
+          <w:color w:val="CE9178"/>
+          <w:sz w:val="21"/>
+          <w:szCs w:val="21"/>
+          <w:lang w:eastAsia="fr-FR"/>
+        </w:rPr>
+        <w:t>isbn</w:t>
+      </w:r>
+      <w:proofErr w:type="spellEnd"/>
+      <w:r>
+        <w:rPr>
+          <w:rFonts w:ascii="Consolas" w:eastAsia="Times New Roman" w:hAnsi="Consolas" w:cs="Times New Roman"/>
+          <w:color w:val="CE9178"/>
+          <w:sz w:val="21"/>
+          <w:szCs w:val="21"/>
+          <w:lang w:eastAsia="fr-FR"/>
+        </w:rPr>
+        <w:t>) REFERENCES livre(</w:t>
+      </w:r>
+      <w:proofErr w:type="spellStart"/>
+      <w:r>
+        <w:rPr>
+          <w:rFonts w:ascii="Consolas" w:eastAsia="Times New Roman" w:hAnsi="Consolas" w:cs="Times New Roman"/>
+          <w:color w:val="CE9178"/>
+          <w:sz w:val="21"/>
+          <w:szCs w:val="21"/>
+          <w:lang w:eastAsia="fr-FR"/>
+        </w:rPr>
+        <w:t>isbn</w:t>
+      </w:r>
+      <w:proofErr w:type="spellEnd"/>
+      <w:r>
+        <w:rPr>
+          <w:rFonts w:ascii="Consolas" w:eastAsia="Times New Roman" w:hAnsi="Consolas" w:cs="Times New Roman"/>
+          <w:color w:val="CE9178"/>
+          <w:sz w:val="21"/>
+          <w:szCs w:val="21"/>
+          <w:lang w:eastAsia="fr-FR"/>
+        </w:rPr>
+        <w:t>),</w:t>
+      </w:r>
+    </w:p>
+    <w:p>
+      <w:pPr>
+        <w:shd w:val="clear" w:color="auto" w:fill="000000"/>
+        <w:spacing w:after="0" w:line="285" w:lineRule="atLeast"/>
+        <w:rPr>
+          <w:rFonts w:ascii="Consolas" w:eastAsia="Times New Roman" w:hAnsi="Consolas" w:cs="Times New Roman"/>
+          <w:color w:val="CE9178"/>
+          <w:sz w:val="21"/>
+          <w:szCs w:val="21"/>
+          <w:lang w:eastAsia="fr-FR"/>
+        </w:rPr>
+      </w:pPr>
+      <w:r>
+        <w:rPr>
+          <w:rFonts w:ascii="Consolas" w:eastAsia="Times New Roman" w:hAnsi="Consolas" w:cs="Times New Roman"/>
+          <w:color w:val="CE9178"/>
+          <w:sz w:val="21"/>
+          <w:szCs w:val="21"/>
+          <w:lang w:eastAsia="fr-FR"/>
+        </w:rPr>
+        <w:tab/>
+        <w:t xml:space="preserve">CONSTRAINT </w:t>
+      </w:r>
+      <w:proofErr w:type="spellStart"/>
+      <w:r>
+        <w:rPr>
+          <w:rFonts w:ascii="Consolas" w:eastAsia="Times New Roman" w:hAnsi="Consolas" w:cs="Times New Roman"/>
+          <w:color w:val="CE9178"/>
+          <w:sz w:val="21"/>
+          <w:szCs w:val="21"/>
+          <w:lang w:eastAsia="fr-FR"/>
+        </w:rPr>
+        <w:t>fk_exemplaire_proprietaire</w:t>
+      </w:r>
+      <w:proofErr w:type="spellEnd"/>
+      <w:r>
+        <w:rPr>
+          <w:rFonts w:ascii="Consolas" w:eastAsia="Times New Roman" w:hAnsi="Consolas" w:cs="Times New Roman"/>
+          <w:color w:val="CE9178"/>
+          <w:sz w:val="21"/>
+          <w:szCs w:val="21"/>
+          <w:lang w:eastAsia="fr-FR"/>
+        </w:rPr>
+        <w:t xml:space="preserve"> FOREIGN KEY (</w:t>
+      </w:r>
+      <w:proofErr w:type="spellStart"/>
+      <w:r>
+        <w:rPr>
+          <w:rFonts w:ascii="Consolas" w:eastAsia="Times New Roman" w:hAnsi="Consolas" w:cs="Times New Roman"/>
+          <w:color w:val="CE9178"/>
+          <w:sz w:val="21"/>
+          <w:szCs w:val="21"/>
+          <w:lang w:eastAsia="fr-FR"/>
+        </w:rPr>
+        <w:t>id_proprietaire</w:t>
+      </w:r>
+      <w:proofErr w:type="spellEnd"/>
+      <w:r>
+        <w:rPr>
+          <w:rFonts w:ascii="Consolas" w:eastAsia="Times New Roman" w:hAnsi="Consolas" w:cs="Times New Roman"/>
+          <w:color w:val="CE9178"/>
+          <w:sz w:val="21"/>
+          <w:szCs w:val="21"/>
+          <w:lang w:eastAsia="fr-FR"/>
+        </w:rPr>
+        <w:t>) REFERENCES utilisateur(</w:t>
+      </w:r>
+      <w:proofErr w:type="spellStart"/>
+      <w:r>
+        <w:rPr>
+          <w:rFonts w:ascii="Consolas" w:eastAsia="Times New Roman" w:hAnsi="Consolas" w:cs="Times New Roman"/>
+          <w:color w:val="CE9178"/>
+          <w:sz w:val="21"/>
+          <w:szCs w:val="21"/>
+          <w:lang w:eastAsia="fr-FR"/>
+        </w:rPr>
+        <w:t>id_utilisateur</w:t>
+      </w:r>
+      <w:proofErr w:type="spellEnd"/>
+      <w:r>
+        <w:rPr>
+          <w:rFonts w:ascii="Consolas" w:eastAsia="Times New Roman" w:hAnsi="Consolas" w:cs="Times New Roman"/>
+          <w:color w:val="CE9178"/>
+          <w:sz w:val="21"/>
+          <w:szCs w:val="21"/>
+          <w:lang w:eastAsia="fr-FR"/>
+        </w:rPr>
+        <w:t>)</w:t>
+      </w:r>
+    </w:p>
+    <w:p>
+      <w:pPr>
+        <w:shd w:val="clear" w:color="auto" w:fill="000000"/>
+        <w:spacing w:after="0" w:line="285" w:lineRule="atLeast"/>
+        <w:rPr>
+          <w:rFonts w:ascii="Consolas" w:eastAsia="Times New Roman" w:hAnsi="Consolas" w:cs="Times New Roman"/>
+          <w:color w:val="CE9178"/>
+          <w:sz w:val="21"/>
+          <w:szCs w:val="21"/>
+          <w:lang w:eastAsia="fr-FR"/>
+        </w:rPr>
+      </w:pPr>
+      <w:r>
+        <w:rPr>
+          <w:rFonts w:ascii="Consolas" w:eastAsia="Times New Roman" w:hAnsi="Consolas" w:cs="Times New Roman"/>
+          <w:color w:val="CE9178"/>
+          <w:sz w:val="21"/>
+          <w:szCs w:val="21"/>
+          <w:lang w:eastAsia="fr-FR"/>
+        </w:rPr>
+        <w:t>);</w:t>
+      </w:r>
+    </w:p>
+    <w:p>
+      <w:pPr>
+        <w:shd w:val="clear" w:color="auto" w:fill="000000"/>
+        <w:spacing w:after="0" w:line="285" w:lineRule="atLeast"/>
+        <w:rPr>
+          <w:rFonts w:ascii="Consolas" w:eastAsia="Times New Roman" w:hAnsi="Consolas" w:cs="Times New Roman"/>
+          <w:color w:val="CE9178"/>
+          <w:sz w:val="21"/>
+          <w:szCs w:val="21"/>
+          <w:lang w:eastAsia="fr-FR"/>
+        </w:rPr>
+      </w:pPr>
+    </w:p>
+    <w:p>
+      <w:pPr>
+        <w:shd w:val="clear" w:color="auto" w:fill="000000"/>
+        <w:spacing w:after="0" w:line="285" w:lineRule="atLeast"/>
+        <w:rPr>
+          <w:rFonts w:ascii="Consolas" w:eastAsia="Times New Roman" w:hAnsi="Consolas" w:cs="Times New Roman"/>
+          <w:color w:val="CE9178"/>
+          <w:sz w:val="21"/>
+          <w:szCs w:val="21"/>
+          <w:lang w:eastAsia="fr-FR"/>
+        </w:rPr>
+      </w:pPr>
+      <w:r>
+        <w:rPr>
+          <w:rFonts w:ascii="Consolas" w:eastAsia="Times New Roman" w:hAnsi="Consolas" w:cs="Times New Roman"/>
+          <w:color w:val="CE9178"/>
+          <w:sz w:val="21"/>
+          <w:szCs w:val="21"/>
+          <w:lang w:eastAsia="fr-FR"/>
+        </w:rPr>
+        <w:t>CREATE TABLE emprunt(</w:t>
+      </w:r>
+    </w:p>
+    <w:p>
+      <w:pPr>
+        <w:shd w:val="clear" w:color="auto" w:fill="000000"/>
+        <w:spacing w:after="0" w:line="285" w:lineRule="atLeast"/>
+        <w:rPr>
+          <w:rFonts w:ascii="Consolas" w:eastAsia="Times New Roman" w:hAnsi="Consolas" w:cs="Times New Roman"/>
+          <w:color w:val="CE9178"/>
+          <w:sz w:val="21"/>
+          <w:szCs w:val="21"/>
+          <w:lang w:eastAsia="fr-FR"/>
+        </w:rPr>
+      </w:pPr>
+      <w:r>
+        <w:rPr>
+          <w:rFonts w:ascii="Consolas" w:eastAsia="Times New Roman" w:hAnsi="Consolas" w:cs="Times New Roman"/>
+          <w:color w:val="CE9178"/>
+          <w:sz w:val="21"/>
+          <w:szCs w:val="21"/>
+          <w:lang w:eastAsia="fr-FR"/>
+        </w:rPr>
+        <w:tab/>
+      </w:r>
+      <w:proofErr w:type="spellStart"/>
+      <w:r>
+        <w:rPr>
+          <w:rFonts w:ascii="Consolas" w:eastAsia="Times New Roman" w:hAnsi="Consolas" w:cs="Times New Roman"/>
+          <w:color w:val="CE9178"/>
+          <w:sz w:val="21"/>
+          <w:szCs w:val="21"/>
+          <w:lang w:eastAsia="fr-FR"/>
+        </w:rPr>
+        <w:t>id_emprunt</w:t>
+      </w:r>
+      <w:proofErr w:type="spellEnd"/>
+      <w:r>
+        <w:rPr>
+          <w:rFonts w:ascii="Consolas" w:eastAsia="Times New Roman" w:hAnsi="Consolas" w:cs="Times New Roman"/>
+          <w:color w:val="CE9178"/>
+          <w:sz w:val="21"/>
+          <w:szCs w:val="21"/>
+          <w:lang w:eastAsia="fr-FR"/>
+        </w:rPr>
+        <w:t xml:space="preserve"> INT PRIMARY KEY AUTO_INCREMENT,</w:t>
+      </w:r>
+    </w:p>
+    <w:p>
+      <w:pPr>
+        <w:shd w:val="clear" w:color="auto" w:fill="000000"/>
+        <w:spacing w:after="0" w:line="285" w:lineRule="atLeast"/>
+        <w:rPr>
+          <w:rFonts w:ascii="Consolas" w:eastAsia="Times New Roman" w:hAnsi="Consolas" w:cs="Times New Roman"/>
+          <w:color w:val="CE9178"/>
+          <w:sz w:val="21"/>
+          <w:szCs w:val="21"/>
+          <w:lang w:eastAsia="fr-FR"/>
+        </w:rPr>
+      </w:pPr>
+      <w:r>
+        <w:rPr>
+          <w:rFonts w:ascii="Consolas" w:eastAsia="Times New Roman" w:hAnsi="Consolas" w:cs="Times New Roman"/>
+          <w:color w:val="CE9178"/>
+          <w:sz w:val="21"/>
+          <w:szCs w:val="21"/>
+          <w:lang w:eastAsia="fr-FR"/>
+        </w:rPr>
+        <w:tab/>
+      </w:r>
+      <w:proofErr w:type="spellStart"/>
+      <w:r>
+        <w:rPr>
+          <w:rFonts w:ascii="Consolas" w:eastAsia="Times New Roman" w:hAnsi="Consolas" w:cs="Times New Roman"/>
+          <w:color w:val="CE9178"/>
+          <w:sz w:val="21"/>
+          <w:szCs w:val="21"/>
+          <w:lang w:eastAsia="fr-FR"/>
+        </w:rPr>
+        <w:t>date_emprunt</w:t>
+      </w:r>
+      <w:proofErr w:type="spellEnd"/>
+      <w:r>
+        <w:rPr>
+          <w:rFonts w:ascii="Consolas" w:eastAsia="Times New Roman" w:hAnsi="Consolas" w:cs="Times New Roman"/>
+          <w:color w:val="CE9178"/>
+          <w:sz w:val="21"/>
+          <w:szCs w:val="21"/>
+          <w:lang w:eastAsia="fr-FR"/>
+        </w:rPr>
+        <w:t xml:space="preserve"> DATETIME NOT NULL,</w:t>
+      </w:r>
+    </w:p>
+    <w:p>
+      <w:pPr>
+        <w:shd w:val="clear" w:color="auto" w:fill="000000"/>
+        <w:spacing w:after="0" w:line="285" w:lineRule="atLeast"/>
+        <w:rPr>
+          <w:rFonts w:ascii="Consolas" w:eastAsia="Times New Roman" w:hAnsi="Consolas" w:cs="Times New Roman"/>
+          <w:color w:val="CE9178"/>
+          <w:sz w:val="21"/>
+          <w:szCs w:val="21"/>
+          <w:lang w:eastAsia="fr-FR"/>
+        </w:rPr>
+      </w:pPr>
+      <w:r>
+        <w:rPr>
+          <w:rFonts w:ascii="Consolas" w:eastAsia="Times New Roman" w:hAnsi="Consolas" w:cs="Times New Roman"/>
+          <w:color w:val="CE9178"/>
+          <w:sz w:val="21"/>
+          <w:szCs w:val="21"/>
+          <w:lang w:eastAsia="fr-FR"/>
+        </w:rPr>
+        <w:tab/>
+      </w:r>
+      <w:proofErr w:type="spellStart"/>
+      <w:r>
+        <w:rPr>
+          <w:rFonts w:ascii="Consolas" w:eastAsia="Times New Roman" w:hAnsi="Consolas" w:cs="Times New Roman"/>
+          <w:color w:val="CE9178"/>
+          <w:sz w:val="21"/>
+          <w:szCs w:val="21"/>
+          <w:lang w:eastAsia="fr-FR"/>
+        </w:rPr>
+        <w:t>date_retour</w:t>
+      </w:r>
+      <w:proofErr w:type="spellEnd"/>
+      <w:r>
+        <w:rPr>
+          <w:rFonts w:ascii="Consolas" w:eastAsia="Times New Roman" w:hAnsi="Consolas" w:cs="Times New Roman"/>
+          <w:color w:val="CE9178"/>
+          <w:sz w:val="21"/>
+          <w:szCs w:val="21"/>
+          <w:lang w:eastAsia="fr-FR"/>
+        </w:rPr>
+        <w:t xml:space="preserve"> DATETIME NULL,</w:t>
+      </w:r>
+    </w:p>
+    <w:p>
+      <w:pPr>
+        <w:shd w:val="clear" w:color="auto" w:fill="000000"/>
+        <w:spacing w:after="0" w:line="285" w:lineRule="atLeast"/>
+        <w:rPr>
+          <w:rFonts w:ascii="Consolas" w:eastAsia="Times New Roman" w:hAnsi="Consolas" w:cs="Times New Roman"/>
+          <w:color w:val="CE9178"/>
+          <w:sz w:val="21"/>
+          <w:szCs w:val="21"/>
+          <w:lang w:eastAsia="fr-FR"/>
+        </w:rPr>
+      </w:pPr>
+      <w:r>
+        <w:rPr>
+          <w:rFonts w:ascii="Consolas" w:eastAsia="Times New Roman" w:hAnsi="Consolas" w:cs="Times New Roman"/>
+          <w:color w:val="CE9178"/>
+          <w:sz w:val="21"/>
+          <w:szCs w:val="21"/>
+          <w:lang w:eastAsia="fr-FR"/>
+        </w:rPr>
+        <w:tab/>
+      </w:r>
+      <w:proofErr w:type="spellStart"/>
+      <w:r>
+        <w:rPr>
+          <w:rFonts w:ascii="Consolas" w:eastAsia="Times New Roman" w:hAnsi="Consolas" w:cs="Times New Roman"/>
+          <w:color w:val="CE9178"/>
+          <w:sz w:val="21"/>
+          <w:szCs w:val="21"/>
+          <w:lang w:eastAsia="fr-FR"/>
+        </w:rPr>
+        <w:t>id_emprunteur</w:t>
+      </w:r>
+      <w:proofErr w:type="spellEnd"/>
+      <w:r>
+        <w:rPr>
+          <w:rFonts w:ascii="Consolas" w:eastAsia="Times New Roman" w:hAnsi="Consolas" w:cs="Times New Roman"/>
+          <w:color w:val="CE9178"/>
+          <w:sz w:val="21"/>
+          <w:szCs w:val="21"/>
+          <w:lang w:eastAsia="fr-FR"/>
+        </w:rPr>
+        <w:t xml:space="preserve"> INT NOT NULL,</w:t>
+      </w:r>
+    </w:p>
+    <w:p>
+      <w:pPr>
+        <w:shd w:val="clear" w:color="auto" w:fill="000000"/>
+        <w:spacing w:after="0" w:line="285" w:lineRule="atLeast"/>
+        <w:rPr>
+          <w:rFonts w:ascii="Consolas" w:eastAsia="Times New Roman" w:hAnsi="Consolas" w:cs="Times New Roman"/>
+          <w:color w:val="CE9178"/>
+          <w:sz w:val="21"/>
+          <w:szCs w:val="21"/>
+          <w:lang w:eastAsia="fr-FR"/>
+        </w:rPr>
+      </w:pPr>
+      <w:r>
+        <w:rPr>
+          <w:rFonts w:ascii="Consolas" w:eastAsia="Times New Roman" w:hAnsi="Consolas" w:cs="Times New Roman"/>
+          <w:color w:val="CE9178"/>
+          <w:sz w:val="21"/>
+          <w:szCs w:val="21"/>
+          <w:lang w:eastAsia="fr-FR"/>
+        </w:rPr>
+        <w:tab/>
+      </w:r>
+      <w:proofErr w:type="spellStart"/>
+      <w:r>
+        <w:rPr>
+          <w:rFonts w:ascii="Consolas" w:eastAsia="Times New Roman" w:hAnsi="Consolas" w:cs="Times New Roman"/>
+          <w:color w:val="CE9178"/>
+          <w:sz w:val="21"/>
+          <w:szCs w:val="21"/>
+          <w:lang w:eastAsia="fr-FR"/>
+        </w:rPr>
+        <w:t>id_exemplaire</w:t>
+      </w:r>
+      <w:proofErr w:type="spellEnd"/>
+      <w:r>
+        <w:rPr>
+          <w:rFonts w:ascii="Consolas" w:eastAsia="Times New Roman" w:hAnsi="Consolas" w:cs="Times New Roman"/>
+          <w:color w:val="CE9178"/>
+          <w:sz w:val="21"/>
+          <w:szCs w:val="21"/>
+          <w:lang w:eastAsia="fr-FR"/>
+        </w:rPr>
+        <w:t xml:space="preserve"> INT NOT NULL,</w:t>
+      </w:r>
+    </w:p>
+    <w:p>
+      <w:pPr>
+        <w:shd w:val="clear" w:color="auto" w:fill="000000"/>
+        <w:spacing w:after="0" w:line="285" w:lineRule="atLeast"/>
+        <w:rPr>
+          <w:rFonts w:ascii="Consolas" w:eastAsia="Times New Roman" w:hAnsi="Consolas" w:cs="Times New Roman"/>
+          <w:color w:val="CE9178"/>
+          <w:sz w:val="21"/>
+          <w:szCs w:val="21"/>
+          <w:lang w:eastAsia="fr-FR"/>
+        </w:rPr>
+      </w:pPr>
+    </w:p>
+    <w:p>
+      <w:pPr>
+        <w:shd w:val="clear" w:color="auto" w:fill="000000"/>
+        <w:spacing w:after="0" w:line="285" w:lineRule="atLeast"/>
+        <w:rPr>
+          <w:rFonts w:ascii="Consolas" w:eastAsia="Times New Roman" w:hAnsi="Consolas" w:cs="Times New Roman"/>
+          <w:color w:val="CE9178"/>
+          <w:sz w:val="21"/>
+          <w:szCs w:val="21"/>
+          <w:lang w:eastAsia="fr-FR"/>
+        </w:rPr>
+      </w:pPr>
+      <w:r>
+        <w:rPr>
+          <w:rFonts w:ascii="Consolas" w:eastAsia="Times New Roman" w:hAnsi="Consolas" w:cs="Times New Roman"/>
+          <w:color w:val="CE9178"/>
+          <w:sz w:val="21"/>
+          <w:szCs w:val="21"/>
+          <w:lang w:eastAsia="fr-FR"/>
+        </w:rPr>
+        <w:tab/>
+        <w:t xml:space="preserve">CONSTRAINT </w:t>
+      </w:r>
+      <w:proofErr w:type="spellStart"/>
+      <w:r>
+        <w:rPr>
+          <w:rFonts w:ascii="Consolas" w:eastAsia="Times New Roman" w:hAnsi="Consolas" w:cs="Times New Roman"/>
+          <w:color w:val="CE9178"/>
+          <w:sz w:val="21"/>
+          <w:szCs w:val="21"/>
+          <w:lang w:eastAsia="fr-FR"/>
+        </w:rPr>
+        <w:t>fk_emprunt_emprenteur</w:t>
+      </w:r>
+      <w:proofErr w:type="spellEnd"/>
+      <w:r>
+        <w:rPr>
+          <w:rFonts w:ascii="Consolas" w:eastAsia="Times New Roman" w:hAnsi="Consolas" w:cs="Times New Roman"/>
+          <w:color w:val="CE9178"/>
+          <w:sz w:val="21"/>
+          <w:szCs w:val="21"/>
+          <w:lang w:eastAsia="fr-FR"/>
+        </w:rPr>
+        <w:t xml:space="preserve"> FOREIGN KEY (</w:t>
+      </w:r>
+      <w:proofErr w:type="spellStart"/>
+      <w:r>
+        <w:rPr>
+          <w:rFonts w:ascii="Consolas" w:eastAsia="Times New Roman" w:hAnsi="Consolas" w:cs="Times New Roman"/>
+          <w:color w:val="CE9178"/>
+          <w:sz w:val="21"/>
+          <w:szCs w:val="21"/>
+          <w:lang w:eastAsia="fr-FR"/>
+        </w:rPr>
+        <w:t>id_emprunteur</w:t>
+      </w:r>
+      <w:proofErr w:type="spellEnd"/>
+      <w:r>
+        <w:rPr>
+          <w:rFonts w:ascii="Consolas" w:eastAsia="Times New Roman" w:hAnsi="Consolas" w:cs="Times New Roman"/>
+          <w:color w:val="CE9178"/>
+          <w:sz w:val="21"/>
+          <w:szCs w:val="21"/>
+          <w:lang w:eastAsia="fr-FR"/>
+        </w:rPr>
+        <w:t>) REFERENCES utilisateur(</w:t>
+      </w:r>
+      <w:proofErr w:type="spellStart"/>
+      <w:r>
+        <w:rPr>
+          <w:rFonts w:ascii="Consolas" w:eastAsia="Times New Roman" w:hAnsi="Consolas" w:cs="Times New Roman"/>
+          <w:color w:val="CE9178"/>
+          <w:sz w:val="21"/>
+          <w:szCs w:val="21"/>
+          <w:lang w:eastAsia="fr-FR"/>
+        </w:rPr>
+        <w:t>id_utilisateur</w:t>
+      </w:r>
+      <w:proofErr w:type="spellEnd"/>
+      <w:r>
+        <w:rPr>
+          <w:rFonts w:ascii="Consolas" w:eastAsia="Times New Roman" w:hAnsi="Consolas" w:cs="Times New Roman"/>
+          <w:color w:val="CE9178"/>
+          <w:sz w:val="21"/>
+          <w:szCs w:val="21"/>
+          <w:lang w:eastAsia="fr-FR"/>
+        </w:rPr>
+        <w:t>),</w:t>
+      </w:r>
+    </w:p>
+    <w:p>
+      <w:pPr>
+        <w:shd w:val="clear" w:color="auto" w:fill="000000"/>
+        <w:spacing w:after="0" w:line="285" w:lineRule="atLeast"/>
+        <w:rPr>
+          <w:rFonts w:ascii="Consolas" w:eastAsia="Times New Roman" w:hAnsi="Consolas" w:cs="Times New Roman"/>
+          <w:color w:val="CE9178"/>
+          <w:sz w:val="21"/>
+          <w:szCs w:val="21"/>
+          <w:lang w:eastAsia="fr-FR"/>
+        </w:rPr>
+      </w:pPr>
+      <w:r>
+        <w:rPr>
+          <w:rFonts w:ascii="Consolas" w:eastAsia="Times New Roman" w:hAnsi="Consolas" w:cs="Times New Roman"/>
+          <w:color w:val="CE9178"/>
+          <w:sz w:val="21"/>
+          <w:szCs w:val="21"/>
+          <w:lang w:eastAsia="fr-FR"/>
+        </w:rPr>
+        <w:tab/>
+        <w:t xml:space="preserve">CONSTRAINT </w:t>
+      </w:r>
+      <w:proofErr w:type="spellStart"/>
+      <w:r>
+        <w:rPr>
+          <w:rFonts w:ascii="Consolas" w:eastAsia="Times New Roman" w:hAnsi="Consolas" w:cs="Times New Roman"/>
+          <w:color w:val="CE9178"/>
+          <w:sz w:val="21"/>
+          <w:szCs w:val="21"/>
+          <w:lang w:eastAsia="fr-FR"/>
+        </w:rPr>
+        <w:t>fk_emprunt_exemplaire</w:t>
+      </w:r>
+      <w:proofErr w:type="spellEnd"/>
+      <w:r>
+        <w:rPr>
+          <w:rFonts w:ascii="Consolas" w:eastAsia="Times New Roman" w:hAnsi="Consolas" w:cs="Times New Roman"/>
+          <w:color w:val="CE9178"/>
+          <w:sz w:val="21"/>
+          <w:szCs w:val="21"/>
+          <w:lang w:eastAsia="fr-FR"/>
+        </w:rPr>
+        <w:t xml:space="preserve"> FOREIGN KEY (</w:t>
+      </w:r>
+      <w:proofErr w:type="spellStart"/>
+      <w:r>
+        <w:rPr>
+          <w:rFonts w:ascii="Consolas" w:eastAsia="Times New Roman" w:hAnsi="Consolas" w:cs="Times New Roman"/>
+          <w:color w:val="CE9178"/>
+          <w:sz w:val="21"/>
+          <w:szCs w:val="21"/>
+          <w:lang w:eastAsia="fr-FR"/>
+        </w:rPr>
+        <w:t>id_exemplaire</w:t>
+      </w:r>
+      <w:proofErr w:type="spellEnd"/>
+      <w:r>
+        <w:rPr>
+          <w:rFonts w:ascii="Consolas" w:eastAsia="Times New Roman" w:hAnsi="Consolas" w:cs="Times New Roman"/>
+          <w:color w:val="CE9178"/>
+          <w:sz w:val="21"/>
+          <w:szCs w:val="21"/>
+          <w:lang w:eastAsia="fr-FR"/>
+        </w:rPr>
+        <w:t>) REFERENCES exemplaire(</w:t>
+      </w:r>
+      <w:proofErr w:type="spellStart"/>
+      <w:r>
+        <w:rPr>
+          <w:rFonts w:ascii="Consolas" w:eastAsia="Times New Roman" w:hAnsi="Consolas" w:cs="Times New Roman"/>
+          <w:color w:val="CE9178"/>
+          <w:sz w:val="21"/>
+          <w:szCs w:val="21"/>
+          <w:lang w:eastAsia="fr-FR"/>
+        </w:rPr>
+        <w:t>id_exemplaire</w:t>
+      </w:r>
+      <w:proofErr w:type="spellEnd"/>
+      <w:r>
+        <w:rPr>
+          <w:rFonts w:ascii="Consolas" w:eastAsia="Times New Roman" w:hAnsi="Consolas" w:cs="Times New Roman"/>
+          <w:color w:val="CE9178"/>
+          <w:sz w:val="21"/>
+          <w:szCs w:val="21"/>
+          <w:lang w:eastAsia="fr-FR"/>
+        </w:rPr>
+        <w:t>)</w:t>
+      </w:r>
+    </w:p>
+    <w:p>
+      <w:pPr>
+        <w:shd w:val="clear" w:color="auto" w:fill="000000"/>
+        <w:spacing w:after="0" w:line="285" w:lineRule="atLeast"/>
+        <w:rPr>
+          <w:rFonts w:ascii="Consolas" w:eastAsia="Times New Roman" w:hAnsi="Consolas" w:cs="Times New Roman"/>
+          <w:color w:val="CE9178"/>
+          <w:sz w:val="21"/>
+          <w:szCs w:val="21"/>
+          <w:lang w:eastAsia="fr-FR"/>
+        </w:rPr>
+      </w:pPr>
+      <w:r>
+        <w:rPr>
+          <w:rFonts w:ascii="Consolas" w:eastAsia="Times New Roman" w:hAnsi="Consolas" w:cs="Times New Roman"/>
+          <w:color w:val="CE9178"/>
+          <w:sz w:val="21"/>
+          <w:szCs w:val="21"/>
+          <w:lang w:eastAsia="fr-FR"/>
+        </w:rPr>
+        <w:t>);</w:t>
+      </w:r>
+    </w:p>
+    <w:p/>
+    <w:p>
+      <w:pPr>
+        <w:pStyle w:val="Titre1"/>
+      </w:pPr>
+      <w:r>
+        <w:t>Sprint 6 : PHP connexion PDO</w:t>
+      </w:r>
+    </w:p>
+    <w:p>
+      <w:r>
+        <w:t>Après une balise PHP,</w:t>
+      </w:r>
+    </w:p>
+    <w:p>
+      <w:pPr>
+        <w:shd w:val="clear" w:color="auto" w:fill="000000"/>
+        <w:spacing w:after="0" w:line="285" w:lineRule="atLeast"/>
+        <w:rPr>
+          <w:rFonts w:ascii="Consolas" w:eastAsia="Times New Roman" w:hAnsi="Consolas" w:cs="Times New Roman"/>
+          <w:color w:val="70AD47" w:themeColor="accent6"/>
+          <w:sz w:val="21"/>
+          <w:szCs w:val="21"/>
+          <w:lang w:eastAsia="fr-FR"/>
+        </w:rPr>
+      </w:pPr>
+      <w:r>
+        <w:rPr>
+          <w:rFonts w:ascii="Consolas" w:eastAsia="Times New Roman" w:hAnsi="Consolas" w:cs="Times New Roman"/>
+          <w:color w:val="9CDCFE"/>
+          <w:sz w:val="21"/>
+          <w:szCs w:val="21"/>
+          <w:lang w:eastAsia="fr-FR"/>
+        </w:rPr>
+        <w:t>$host</w:t>
+      </w:r>
+      <w:r>
+        <w:rPr>
+          <w:rFonts w:ascii="Consolas" w:eastAsia="Times New Roman" w:hAnsi="Consolas" w:cs="Times New Roman"/>
           <w:color w:val="FFFFFF"/>
           <w:sz w:val="21"/>
           <w:szCs w:val="21"/>
           <w:lang w:eastAsia="fr-FR"/>
         </w:rPr>
+        <w:t xml:space="preserve"> </w:t>
+      </w:r>
+      <w:r>
+        <w:rPr>
+          <w:rFonts w:ascii="Consolas" w:eastAsia="Times New Roman" w:hAnsi="Consolas" w:cs="Times New Roman"/>
+          <w:color w:val="D4D4D4"/>
+          <w:sz w:val="21"/>
+          <w:szCs w:val="21"/>
+          <w:lang w:eastAsia="fr-FR"/>
+        </w:rPr>
+        <w:t>=</w:t>
+      </w:r>
+      <w:r>
+        <w:rPr>
+          <w:rFonts w:ascii="Consolas" w:eastAsia="Times New Roman" w:hAnsi="Consolas" w:cs="Times New Roman"/>
+          <w:color w:val="FFFFFF"/>
+          <w:sz w:val="21"/>
+          <w:szCs w:val="21"/>
+          <w:lang w:eastAsia="fr-FR"/>
+        </w:rPr>
+        <w:t xml:space="preserve"> </w:t>
+      </w:r>
+      <w:r>
+        <w:rPr>
+          <w:rFonts w:ascii="Consolas" w:eastAsia="Times New Roman" w:hAnsi="Consolas" w:cs="Times New Roman"/>
+          <w:color w:val="CE9178"/>
+          <w:sz w:val="21"/>
+          <w:szCs w:val="21"/>
+          <w:lang w:eastAsia="fr-FR"/>
+        </w:rPr>
+        <w:t>"</w:t>
+      </w:r>
+      <w:proofErr w:type="spellStart"/>
+      <w:r>
+        <w:rPr>
+          <w:rFonts w:ascii="Consolas" w:eastAsia="Times New Roman" w:hAnsi="Consolas" w:cs="Times New Roman"/>
+          <w:color w:val="CE9178"/>
+          <w:sz w:val="21"/>
+          <w:szCs w:val="21"/>
+          <w:lang w:eastAsia="fr-FR"/>
+        </w:rPr>
+        <w:t>localhost</w:t>
+      </w:r>
+      <w:proofErr w:type="spellEnd"/>
+      <w:r>
+        <w:rPr>
+          <w:rFonts w:ascii="Consolas" w:eastAsia="Times New Roman" w:hAnsi="Consolas" w:cs="Times New Roman"/>
+          <w:color w:val="CE9178"/>
+          <w:sz w:val="21"/>
+          <w:szCs w:val="21"/>
+          <w:lang w:eastAsia="fr-FR"/>
+        </w:rPr>
+        <w:t>"</w:t>
+      </w:r>
+      <w:r>
+        <w:rPr>
+          <w:rFonts w:ascii="Consolas" w:eastAsia="Times New Roman" w:hAnsi="Consolas" w:cs="Times New Roman"/>
+          <w:color w:val="FFFFFF"/>
+          <w:sz w:val="21"/>
+          <w:szCs w:val="21"/>
+          <w:lang w:eastAsia="fr-FR"/>
+        </w:rPr>
+        <w:t>;</w:t>
+      </w:r>
+      <w:r>
+        <w:rPr>
+          <w:rFonts w:ascii="Consolas" w:eastAsia="Times New Roman" w:hAnsi="Consolas" w:cs="Times New Roman"/>
+          <w:color w:val="FFFFFF"/>
+          <w:sz w:val="21"/>
+          <w:szCs w:val="21"/>
+          <w:lang w:eastAsia="fr-FR"/>
+        </w:rPr>
+        <w:t xml:space="preserve">   </w:t>
+      </w:r>
+      <w:r>
+        <w:rPr>
+          <w:rFonts w:ascii="Consolas" w:eastAsia="Times New Roman" w:hAnsi="Consolas" w:cs="Times New Roman"/>
+          <w:color w:val="70AD47" w:themeColor="accent6"/>
+          <w:sz w:val="21"/>
+          <w:szCs w:val="21"/>
+          <w:lang w:eastAsia="fr-FR"/>
+        </w:rPr>
+        <w:t>// il est plus simple de stocker sous forme de variable car s’il y a une modification, on aura qu’à le modifier ici. =&gt; Simplifie la maintenabilité</w:t>
+      </w:r>
+    </w:p>
+    <w:p>
+      <w:pPr>
+        <w:shd w:val="clear" w:color="auto" w:fill="000000"/>
+        <w:spacing w:after="0" w:line="285" w:lineRule="atLeast"/>
+        <w:rPr>
+          <w:rFonts w:ascii="Consolas" w:eastAsia="Times New Roman" w:hAnsi="Consolas" w:cs="Times New Roman"/>
+          <w:color w:val="FFFFFF"/>
+          <w:sz w:val="21"/>
+          <w:szCs w:val="21"/>
+          <w:lang w:eastAsia="fr-FR"/>
+        </w:rPr>
       </w:pPr>
       <w:r>
         <w:rPr>
@@ -2563,6 +4138,180 @@
           <w:szCs w:val="21"/>
           <w:lang w:eastAsia="fr-FR"/>
         </w:rPr>
+        <w:t>dbname</w:t>
+      </w:r>
+      <w:proofErr w:type="spellEnd"/>
+      <w:r>
+        <w:rPr>
+          <w:rFonts w:ascii="Consolas" w:eastAsia="Times New Roman" w:hAnsi="Consolas" w:cs="Times New Roman"/>
+          <w:color w:val="D4D4D4"/>
+          <w:sz w:val="21"/>
+          <w:szCs w:val="21"/>
+          <w:lang w:eastAsia="fr-FR"/>
+        </w:rPr>
+        <w:t>=</w:t>
+      </w:r>
+      <w:r>
+        <w:rPr>
+          <w:rFonts w:ascii="Consolas" w:eastAsia="Times New Roman" w:hAnsi="Consolas" w:cs="Times New Roman"/>
+          <w:color w:val="CE9178"/>
+          <w:sz w:val="21"/>
+          <w:szCs w:val="21"/>
+          <w:lang w:eastAsia="fr-FR"/>
+        </w:rPr>
+        <w:t>"</w:t>
+      </w:r>
+      <w:proofErr w:type="spellStart"/>
+      <w:r>
+        <w:rPr>
+          <w:rFonts w:ascii="Consolas" w:eastAsia="Times New Roman" w:hAnsi="Consolas" w:cs="Times New Roman"/>
+          <w:color w:val="CE9178"/>
+          <w:sz w:val="21"/>
+          <w:szCs w:val="21"/>
+          <w:lang w:eastAsia="fr-FR"/>
+        </w:rPr>
+        <w:t>entrepages</w:t>
+      </w:r>
+      <w:proofErr w:type="spellEnd"/>
+      <w:r>
+        <w:rPr>
+          <w:rFonts w:ascii="Consolas" w:eastAsia="Times New Roman" w:hAnsi="Consolas" w:cs="Times New Roman"/>
+          <w:color w:val="CE9178"/>
+          <w:sz w:val="21"/>
+          <w:szCs w:val="21"/>
+          <w:lang w:eastAsia="fr-FR"/>
+        </w:rPr>
+        <w:t>"</w:t>
+      </w:r>
+      <w:r>
+        <w:rPr>
+          <w:rFonts w:ascii="Consolas" w:eastAsia="Times New Roman" w:hAnsi="Consolas" w:cs="Times New Roman"/>
+          <w:color w:val="FFFFFF"/>
+          <w:sz w:val="21"/>
+          <w:szCs w:val="21"/>
+          <w:lang w:eastAsia="fr-FR"/>
+        </w:rPr>
+        <w:t>;</w:t>
+      </w:r>
+    </w:p>
+    <w:p>
+      <w:pPr>
+        <w:shd w:val="clear" w:color="auto" w:fill="000000"/>
+        <w:spacing w:after="0" w:line="285" w:lineRule="atLeast"/>
+        <w:rPr>
+          <w:rFonts w:ascii="Consolas" w:eastAsia="Times New Roman" w:hAnsi="Consolas" w:cs="Times New Roman"/>
+          <w:color w:val="FFFFFF"/>
+          <w:sz w:val="21"/>
+          <w:szCs w:val="21"/>
+          <w:lang w:eastAsia="fr-FR"/>
+        </w:rPr>
+      </w:pPr>
+      <w:r>
+        <w:rPr>
+          <w:rFonts w:ascii="Consolas" w:eastAsia="Times New Roman" w:hAnsi="Consolas" w:cs="Times New Roman"/>
+          <w:color w:val="9CDCFE"/>
+          <w:sz w:val="21"/>
+          <w:szCs w:val="21"/>
+          <w:lang w:eastAsia="fr-FR"/>
+        </w:rPr>
+        <w:t>$</w:t>
+      </w:r>
+      <w:proofErr w:type="spellStart"/>
+      <w:r>
+        <w:rPr>
+          <w:rFonts w:ascii="Consolas" w:eastAsia="Times New Roman" w:hAnsi="Consolas" w:cs="Times New Roman"/>
+          <w:color w:val="9CDCFE"/>
+          <w:sz w:val="21"/>
+          <w:szCs w:val="21"/>
+          <w:lang w:eastAsia="fr-FR"/>
+        </w:rPr>
+        <w:t>username</w:t>
+      </w:r>
+      <w:proofErr w:type="spellEnd"/>
+      <w:r>
+        <w:rPr>
+          <w:rFonts w:ascii="Consolas" w:eastAsia="Times New Roman" w:hAnsi="Consolas" w:cs="Times New Roman"/>
+          <w:color w:val="D4D4D4"/>
+          <w:sz w:val="21"/>
+          <w:szCs w:val="21"/>
+          <w:lang w:eastAsia="fr-FR"/>
+        </w:rPr>
+        <w:t>=</w:t>
+      </w:r>
+      <w:r>
+        <w:rPr>
+          <w:rFonts w:ascii="Consolas" w:eastAsia="Times New Roman" w:hAnsi="Consolas" w:cs="Times New Roman"/>
+          <w:color w:val="CE9178"/>
+          <w:sz w:val="21"/>
+          <w:szCs w:val="21"/>
+          <w:lang w:eastAsia="fr-FR"/>
+        </w:rPr>
+        <w:t>"</w:t>
+      </w:r>
+      <w:proofErr w:type="spellStart"/>
+      <w:r>
+        <w:rPr>
+          <w:rFonts w:ascii="Consolas" w:eastAsia="Times New Roman" w:hAnsi="Consolas" w:cs="Times New Roman"/>
+          <w:color w:val="CE9178"/>
+          <w:sz w:val="21"/>
+          <w:szCs w:val="21"/>
+          <w:lang w:eastAsia="fr-FR"/>
+        </w:rPr>
+        <w:t>root</w:t>
+      </w:r>
+      <w:proofErr w:type="spellEnd"/>
+      <w:r>
+        <w:rPr>
+          <w:rFonts w:ascii="Consolas" w:eastAsia="Times New Roman" w:hAnsi="Consolas" w:cs="Times New Roman"/>
+          <w:color w:val="CE9178"/>
+          <w:sz w:val="21"/>
+          <w:szCs w:val="21"/>
+          <w:lang w:eastAsia="fr-FR"/>
+        </w:rPr>
+        <w:t>"</w:t>
+      </w:r>
+      <w:r>
+        <w:rPr>
+          <w:rFonts w:ascii="Consolas" w:eastAsia="Times New Roman" w:hAnsi="Consolas" w:cs="Times New Roman"/>
+          <w:color w:val="FFFFFF"/>
+          <w:sz w:val="21"/>
+          <w:szCs w:val="21"/>
+          <w:lang w:eastAsia="fr-FR"/>
+        </w:rPr>
+        <w:t>;</w:t>
+      </w:r>
+    </w:p>
+    <w:p>
+      <w:pPr>
+        <w:shd w:val="clear" w:color="auto" w:fill="000000"/>
+        <w:spacing w:after="0" w:line="285" w:lineRule="atLeast"/>
+        <w:rPr>
+          <w:rFonts w:ascii="Consolas" w:eastAsia="Times New Roman" w:hAnsi="Consolas" w:cs="Times New Roman"/>
+          <w:color w:val="FFFFFF"/>
+          <w:sz w:val="21"/>
+          <w:szCs w:val="21"/>
+          <w:lang w:eastAsia="fr-FR"/>
+        </w:rPr>
+      </w:pPr>
+      <w:r>
+        <w:rPr>
+          <w:rFonts w:ascii="Consolas" w:eastAsia="Times New Roman" w:hAnsi="Consolas" w:cs="Times New Roman"/>
+          <w:color w:val="9CDCFE"/>
+          <w:sz w:val="21"/>
+          <w:szCs w:val="21"/>
+          <w:lang w:eastAsia="fr-FR"/>
+        </w:rPr>
+        <w:t>$</w:t>
+      </w:r>
+      <w:proofErr w:type="spellStart"/>
+      <w:r>
+        <w:rPr>
+          <w:rFonts w:ascii="Consolas" w:eastAsia="Times New Roman" w:hAnsi="Consolas" w:cs="Times New Roman"/>
+          <w:color w:val="9CDCFE"/>
+          <w:sz w:val="21"/>
+          <w:szCs w:val="21"/>
+          <w:lang w:eastAsia="fr-FR"/>
+        </w:rPr>
         <w:t>password</w:t>
       </w:r>
       <w:proofErr w:type="spellEnd"/>
@@ -2584,18 +4333,7 @@
           <w:szCs w:val="21"/>
           <w:lang w:eastAsia="fr-FR"/>
         </w:rPr>
-        <w:t>"</w:t>
-      </w:r>
-      <w:proofErr w:type="gramStart"/>
-      <w:r>
-        <w:rPr>
-          <w:rFonts w:ascii="Consolas" w:eastAsia="Times New Roman" w:hAnsi="Consolas" w:cs="Times New Roman"/>
-          <w:color w:val="CE9178"/>
-          <w:sz w:val="21"/>
-          <w:szCs w:val="21"/>
-          <w:lang w:eastAsia="fr-FR"/>
-        </w:rPr>
-        <w:t>"</w:t>
+        <w:t>""</w:t>
       </w:r>
       <w:r>
         <w:rPr>
@@ -2607,7 +4345,6 @@
         </w:rPr>
         <w:t>;</w:t>
       </w:r>
-      <w:proofErr w:type="gramEnd"/>
     </w:p>
     <w:p/>
     <w:p>
@@ -2629,13 +4366,8 @@
       </w:r>
     </w:p>
     <w:p>
-      <w:proofErr w:type="gramStart"/>
-      <w:r>
-        <w:t>Die(</w:t>
-      </w:r>
-      <w:proofErr w:type="gramEnd"/>
-      <w:r>
-        <w:t>) : pour afficher l’erreur et arrêter le programme directement</w:t>
+      <w:r>
+        <w:t>Die() : pour afficher l’erreur et arrêter le programme directement</w:t>
       </w:r>
     </w:p>
     <w:p>
@@ -2659,18 +4391,13 @@
       </w:r>
       <w:proofErr w:type="spellEnd"/>
       <w:r>
-        <w:t>(</w:t>
-      </w:r>
-      <w:proofErr w:type="gramStart"/>
-      <w:r>
-        <w:t>),</w:t>
+        <w:t>(),</w:t>
       </w:r>
       <w:proofErr w:type="spellStart"/>
       <w:r>
         <w:t>etc</w:t>
       </w:r>
       <w:proofErr w:type="spellEnd"/>
-      <w:proofErr w:type="gramEnd"/>
       <w:r>
         <w:t>)/ variables.($host)</w:t>
       </w:r>
@@ -2927,6 +4654,7 @@
     <w:p/>
     <w:p>
       <w:r>
+        <w:lastRenderedPageBreak/>
         <w:t xml:space="preserve">Ne pas oublier de faire </w:t>
       </w:r>
       <w:proofErr w:type="spellStart"/>
@@ -2937,6 +4665,523 @@
       <w:r>
         <w:t xml:space="preserve"> once :</w:t>
       </w:r>
+      <w:r>
+        <w:t xml:space="preserve"> pour le fichier config/</w:t>
+      </w:r>
+      <w:proofErr w:type="spellStart"/>
+      <w:r>
+        <w:t>data.php</w:t>
+      </w:r>
+      <w:proofErr w:type="spellEnd"/>
+    </w:p>
+    <w:p>
+      <w:pPr>
+        <w:pStyle w:val="Titre1"/>
+      </w:pPr>
+      <w:r>
+        <w:t>Sprint 7 : Authentification</w:t>
+      </w:r>
+    </w:p>
+    <w:p>
+      <w:r>
+        <w:t xml:space="preserve">Découverte des chemins relatifs à partir d’une nouvelle page PHP. Jusqu’à maintenant tout partait du fichier </w:t>
+      </w:r>
+      <w:proofErr w:type="spellStart"/>
+      <w:r>
+        <w:t>index.php</w:t>
+      </w:r>
+      <w:proofErr w:type="spellEnd"/>
+      <w:r>
+        <w:t xml:space="preserve"> et qui est dans la racine. En créant des pages comme la page d’inscription, le chemin ne peut plus être juste </w:t>
+      </w:r>
+      <w:proofErr w:type="spellStart"/>
+      <w:r>
+        <w:t>includes</w:t>
+      </w:r>
+      <w:proofErr w:type="spellEnd"/>
+      <w:r>
+        <w:t>/xxx mais « ../</w:t>
+      </w:r>
+      <w:proofErr w:type="spellStart"/>
+      <w:r>
+        <w:t>includes</w:t>
+      </w:r>
+      <w:proofErr w:type="spellEnd"/>
+      <w:r>
+        <w:t xml:space="preserve">/xxx » pour signifier à </w:t>
+      </w:r>
+      <w:proofErr w:type="spellStart"/>
+      <w:r>
+        <w:t>php</w:t>
+      </w:r>
+      <w:proofErr w:type="spellEnd"/>
+      <w:r>
+        <w:t xml:space="preserve"> de remonter dans le dossier. Solution : fichier crée pour « </w:t>
+      </w:r>
+      <w:proofErr w:type="spellStart"/>
+      <w:r>
+        <w:t>app</w:t>
+      </w:r>
+      <w:proofErr w:type="spellEnd"/>
+      <w:r>
+        <w:t> » et pour « </w:t>
+      </w:r>
+      <w:proofErr w:type="spellStart"/>
+      <w:r>
+        <w:t>init</w:t>
+      </w:r>
+      <w:proofErr w:type="spellEnd"/>
+      <w:r>
+        <w:t xml:space="preserve"> » pour déclarer en amont ce que PHP doit faire. </w:t>
+      </w:r>
+    </w:p>
+    <w:p>
+      <w:r>
+        <w:t xml:space="preserve">A retenir : </w:t>
+      </w:r>
+    </w:p>
+    <w:p>
+      <w:pPr>
+        <w:shd w:val="clear" w:color="auto" w:fill="000000"/>
+        <w:spacing w:after="0" w:line="285" w:lineRule="atLeast"/>
+        <w:rPr>
+          <w:rFonts w:ascii="Consolas" w:eastAsia="Times New Roman" w:hAnsi="Consolas" w:cs="Times New Roman"/>
+          <w:color w:val="9CDCFE"/>
+          <w:sz w:val="21"/>
+          <w:szCs w:val="21"/>
+          <w:lang w:eastAsia="fr-FR"/>
+        </w:rPr>
+      </w:pPr>
+      <w:proofErr w:type="spellStart"/>
+      <w:r>
+        <w:rPr>
+          <w:rFonts w:ascii="Consolas" w:eastAsia="Times New Roman" w:hAnsi="Consolas" w:cs="Times New Roman"/>
+          <w:color w:val="9CDCFE"/>
+          <w:sz w:val="21"/>
+          <w:szCs w:val="21"/>
+          <w:lang w:eastAsia="fr-FR"/>
+        </w:rPr>
+        <w:t>password_hash</w:t>
+      </w:r>
+      <w:proofErr w:type="spellEnd"/>
+      <w:r>
+        <w:rPr>
+          <w:rFonts w:ascii="Consolas" w:eastAsia="Times New Roman" w:hAnsi="Consolas" w:cs="Times New Roman"/>
+          <w:color w:val="9CDCFE"/>
+          <w:sz w:val="21"/>
+          <w:szCs w:val="21"/>
+          <w:lang w:eastAsia="fr-FR"/>
+        </w:rPr>
+        <w:t>($</w:t>
+      </w:r>
+      <w:proofErr w:type="spellStart"/>
+      <w:r>
+        <w:rPr>
+          <w:rFonts w:ascii="Consolas" w:eastAsia="Times New Roman" w:hAnsi="Consolas" w:cs="Times New Roman"/>
+          <w:color w:val="9CDCFE"/>
+          <w:sz w:val="21"/>
+          <w:szCs w:val="21"/>
+          <w:lang w:eastAsia="fr-FR"/>
+        </w:rPr>
+        <w:t>mot_de_passe</w:t>
+      </w:r>
+      <w:proofErr w:type="spellEnd"/>
+      <w:r>
+        <w:rPr>
+          <w:rFonts w:ascii="Consolas" w:eastAsia="Times New Roman" w:hAnsi="Consolas" w:cs="Times New Roman"/>
+          <w:color w:val="9CDCFE"/>
+          <w:sz w:val="21"/>
+          <w:szCs w:val="21"/>
+          <w:lang w:eastAsia="fr-FR"/>
+        </w:rPr>
+        <w:t>, PASSWORD_DEFAULT);</w:t>
+      </w:r>
+    </w:p>
+    <w:p>
+      <w:pPr>
+        <w:shd w:val="clear" w:color="auto" w:fill="000000"/>
+        <w:spacing w:after="0" w:line="285" w:lineRule="atLeast"/>
+        <w:rPr>
+          <w:rFonts w:ascii="Consolas" w:eastAsia="Times New Roman" w:hAnsi="Consolas" w:cs="Times New Roman"/>
+          <w:color w:val="9CDCFE"/>
+          <w:sz w:val="21"/>
+          <w:szCs w:val="21"/>
+          <w:lang w:eastAsia="fr-FR"/>
+        </w:rPr>
+      </w:pPr>
+      <w:proofErr w:type="spellStart"/>
+      <w:r>
+        <w:rPr>
+          <w:rFonts w:ascii="Consolas" w:eastAsia="Times New Roman" w:hAnsi="Consolas" w:cs="Times New Roman"/>
+          <w:color w:val="9CDCFE"/>
+          <w:sz w:val="21"/>
+          <w:szCs w:val="21"/>
+          <w:lang w:eastAsia="fr-FR"/>
+        </w:rPr>
+        <w:t>password_verify</w:t>
+      </w:r>
+      <w:proofErr w:type="spellEnd"/>
+      <w:r>
+        <w:rPr>
+          <w:rFonts w:ascii="Consolas" w:eastAsia="Times New Roman" w:hAnsi="Consolas" w:cs="Times New Roman"/>
+          <w:color w:val="9CDCFE"/>
+          <w:sz w:val="21"/>
+          <w:szCs w:val="21"/>
+          <w:lang w:eastAsia="fr-FR"/>
+        </w:rPr>
+        <w:t>($</w:t>
+      </w:r>
+      <w:proofErr w:type="spellStart"/>
+      <w:r>
+        <w:rPr>
+          <w:rFonts w:ascii="Consolas" w:eastAsia="Times New Roman" w:hAnsi="Consolas" w:cs="Times New Roman"/>
+          <w:color w:val="9CDCFE"/>
+          <w:sz w:val="21"/>
+          <w:szCs w:val="21"/>
+          <w:lang w:eastAsia="fr-FR"/>
+        </w:rPr>
+        <w:t>mot_de_passe</w:t>
+      </w:r>
+      <w:proofErr w:type="spellEnd"/>
+      <w:r>
+        <w:rPr>
+          <w:rFonts w:ascii="Consolas" w:eastAsia="Times New Roman" w:hAnsi="Consolas" w:cs="Times New Roman"/>
+          <w:color w:val="9CDCFE"/>
+          <w:sz w:val="21"/>
+          <w:szCs w:val="21"/>
+          <w:lang w:eastAsia="fr-FR"/>
+        </w:rPr>
+        <w:t>, $identifiant["</w:t>
+      </w:r>
+      <w:proofErr w:type="spellStart"/>
+      <w:r>
+        <w:rPr>
+          <w:rFonts w:ascii="Consolas" w:eastAsia="Times New Roman" w:hAnsi="Consolas" w:cs="Times New Roman"/>
+          <w:color w:val="9CDCFE"/>
+          <w:sz w:val="21"/>
+          <w:szCs w:val="21"/>
+          <w:lang w:eastAsia="fr-FR"/>
+        </w:rPr>
+        <w:t>mot_de_passe</w:t>
+      </w:r>
+      <w:proofErr w:type="spellEnd"/>
+      <w:r>
+        <w:rPr>
+          <w:rFonts w:ascii="Consolas" w:eastAsia="Times New Roman" w:hAnsi="Consolas" w:cs="Times New Roman"/>
+          <w:color w:val="9CDCFE"/>
+          <w:sz w:val="21"/>
+          <w:szCs w:val="21"/>
+          <w:lang w:eastAsia="fr-FR"/>
+        </w:rPr>
+        <w:t xml:space="preserve">"]) </w:t>
+      </w:r>
+      <w:r>
+        <w:rPr>
+          <w:rFonts w:ascii="Consolas" w:eastAsia="Times New Roman" w:hAnsi="Consolas" w:cs="Times New Roman"/>
+          <w:color w:val="70AD47" w:themeColor="accent6"/>
+          <w:sz w:val="21"/>
+          <w:szCs w:val="21"/>
+          <w:lang w:eastAsia="fr-FR"/>
+        </w:rPr>
+        <w:t>//$identifiant issus de la requête après une commande SELECT et FETCH(PDO ::FETCH_ASSOC)</w:t>
+      </w:r>
+    </w:p>
+    <w:p/>
+    <w:p>
+      <w:pPr>
+        <w:pStyle w:val="Sansinterligne"/>
+      </w:pPr>
+      <w:proofErr w:type="spellStart"/>
+      <w:r>
+        <w:t>isset</w:t>
+      </w:r>
+      <w:proofErr w:type="spellEnd"/>
+      <w:r>
+        <w:t>() → Est-ce que ça existe et n'est pas NULL ?</w:t>
+      </w:r>
+    </w:p>
+    <w:p>
+      <w:pPr>
+        <w:pStyle w:val="Sansinterligne"/>
+      </w:pPr>
+      <w:proofErr w:type="spellStart"/>
+      <w:r>
+        <w:t>empty</w:t>
+      </w:r>
+      <w:proofErr w:type="spellEnd"/>
+      <w:r>
+        <w:t>() → Est-ce que c'est vide / faux / NULL / inexistant ?</w:t>
+      </w:r>
+    </w:p>
+    <w:p>
+      <w:pPr>
+        <w:pStyle w:val="Sansinterligne"/>
+      </w:pPr>
+    </w:p>
+    <w:p>
+      <w:pPr>
+        <w:pStyle w:val="Sansinterligne"/>
+      </w:pPr>
+      <w:r>
+        <w:t>NULL= absence de valeur</w:t>
+      </w:r>
+    </w:p>
+    <w:p>
+      <w:pPr>
+        <w:pStyle w:val="Sansinterligne"/>
+      </w:pPr>
+      <w:r>
+        <w:t>« » = valeur présente, mais chaine vide</w:t>
+      </w:r>
+    </w:p>
+    <w:p>
+      <w:pPr>
+        <w:pStyle w:val="Sansinterligne"/>
+      </w:pPr>
+    </w:p>
+    <w:p>
+      <w:pPr>
+        <w:shd w:val="clear" w:color="auto" w:fill="000000"/>
+        <w:spacing w:after="0" w:line="285" w:lineRule="atLeast"/>
+        <w:rPr>
+          <w:rFonts w:ascii="Consolas" w:eastAsia="Times New Roman" w:hAnsi="Consolas" w:cs="Times New Roman"/>
+          <w:color w:val="FFFFFF"/>
+          <w:sz w:val="21"/>
+          <w:szCs w:val="21"/>
+          <w:lang w:eastAsia="fr-FR"/>
+        </w:rPr>
+      </w:pPr>
+      <w:r>
+        <w:rPr>
+          <w:rFonts w:ascii="Consolas" w:eastAsia="Times New Roman" w:hAnsi="Consolas" w:cs="Times New Roman"/>
+          <w:color w:val="808080"/>
+          <w:sz w:val="21"/>
+          <w:szCs w:val="21"/>
+          <w:lang w:eastAsia="fr-FR"/>
+        </w:rPr>
+        <w:t>&lt;</w:t>
+      </w:r>
+      <w:proofErr w:type="spellStart"/>
+      <w:r>
+        <w:rPr>
+          <w:rFonts w:ascii="Consolas" w:eastAsia="Times New Roman" w:hAnsi="Consolas" w:cs="Times New Roman"/>
+          <w:color w:val="569CD6"/>
+          <w:sz w:val="21"/>
+          <w:szCs w:val="21"/>
+          <w:lang w:eastAsia="fr-FR"/>
+        </w:rPr>
+        <w:t>pre</w:t>
+      </w:r>
+      <w:proofErr w:type="spellEnd"/>
+      <w:r>
+        <w:rPr>
+          <w:rFonts w:ascii="Consolas" w:eastAsia="Times New Roman" w:hAnsi="Consolas" w:cs="Times New Roman"/>
+          <w:color w:val="808080"/>
+          <w:sz w:val="21"/>
+          <w:szCs w:val="21"/>
+          <w:lang w:eastAsia="fr-FR"/>
+        </w:rPr>
+        <w:t>&gt;</w:t>
+      </w:r>
+    </w:p>
+    <w:p>
+      <w:pPr>
+        <w:shd w:val="clear" w:color="auto" w:fill="000000"/>
+        <w:spacing w:after="0" w:line="285" w:lineRule="atLeast"/>
+        <w:rPr>
+          <w:rFonts w:ascii="Consolas" w:eastAsia="Times New Roman" w:hAnsi="Consolas" w:cs="Times New Roman"/>
+          <w:color w:val="FFFFFF"/>
+          <w:sz w:val="21"/>
+          <w:szCs w:val="21"/>
+          <w:lang w:eastAsia="fr-FR"/>
+        </w:rPr>
+      </w:pPr>
+      <w:r>
+        <w:rPr>
+          <w:rFonts w:ascii="Consolas" w:eastAsia="Times New Roman" w:hAnsi="Consolas" w:cs="Times New Roman"/>
+          <w:color w:val="569CD6"/>
+          <w:sz w:val="21"/>
+          <w:szCs w:val="21"/>
+          <w:lang w:eastAsia="fr-FR"/>
+        </w:rPr>
+        <w:t>&lt;?</w:t>
+      </w:r>
+      <w:proofErr w:type="spellStart"/>
+      <w:r>
+        <w:rPr>
+          <w:rFonts w:ascii="Consolas" w:eastAsia="Times New Roman" w:hAnsi="Consolas" w:cs="Times New Roman"/>
+          <w:color w:val="569CD6"/>
+          <w:sz w:val="21"/>
+          <w:szCs w:val="21"/>
+          <w:lang w:eastAsia="fr-FR"/>
+        </w:rPr>
+        <w:t>php</w:t>
+      </w:r>
+      <w:proofErr w:type="spellEnd"/>
+      <w:r>
+        <w:rPr>
+          <w:rFonts w:ascii="Consolas" w:eastAsia="Times New Roman" w:hAnsi="Consolas" w:cs="Times New Roman"/>
+          <w:color w:val="FFFFFF"/>
+          <w:sz w:val="21"/>
+          <w:szCs w:val="21"/>
+          <w:lang w:eastAsia="fr-FR"/>
+        </w:rPr>
+        <w:t xml:space="preserve"> </w:t>
+      </w:r>
+      <w:proofErr w:type="spellStart"/>
+      <w:r>
+        <w:rPr>
+          <w:rFonts w:ascii="Consolas" w:eastAsia="Times New Roman" w:hAnsi="Consolas" w:cs="Times New Roman"/>
+          <w:color w:val="DCDCAA"/>
+          <w:sz w:val="21"/>
+          <w:szCs w:val="21"/>
+          <w:lang w:eastAsia="fr-FR"/>
+        </w:rPr>
+        <w:t>var_dump</w:t>
+      </w:r>
+      <w:proofErr w:type="spellEnd"/>
+      <w:r>
+        <w:rPr>
+          <w:rFonts w:ascii="Consolas" w:eastAsia="Times New Roman" w:hAnsi="Consolas" w:cs="Times New Roman"/>
+          <w:color w:val="FFFFFF"/>
+          <w:sz w:val="21"/>
+          <w:szCs w:val="21"/>
+          <w:lang w:eastAsia="fr-FR"/>
+        </w:rPr>
+        <w:t>(</w:t>
+      </w:r>
+      <w:r>
+        <w:rPr>
+          <w:rFonts w:ascii="Consolas" w:eastAsia="Times New Roman" w:hAnsi="Consolas" w:cs="Times New Roman"/>
+          <w:color w:val="9CDCFE"/>
+          <w:sz w:val="21"/>
+          <w:szCs w:val="21"/>
+          <w:lang w:eastAsia="fr-FR"/>
+        </w:rPr>
+        <w:t>$_SESSION</w:t>
+      </w:r>
+      <w:r>
+        <w:rPr>
+          <w:rFonts w:ascii="Consolas" w:eastAsia="Times New Roman" w:hAnsi="Consolas" w:cs="Times New Roman"/>
+          <w:color w:val="FFFFFF"/>
+          <w:sz w:val="21"/>
+          <w:szCs w:val="21"/>
+          <w:lang w:eastAsia="fr-FR"/>
+        </w:rPr>
+        <w:t xml:space="preserve">); </w:t>
+      </w:r>
+      <w:r>
+        <w:rPr>
+          <w:rFonts w:ascii="Consolas" w:eastAsia="Times New Roman" w:hAnsi="Consolas" w:cs="Times New Roman"/>
+          <w:color w:val="569CD6"/>
+          <w:sz w:val="21"/>
+          <w:szCs w:val="21"/>
+          <w:lang w:eastAsia="fr-FR"/>
+        </w:rPr>
+        <w:t>?&gt;</w:t>
+      </w:r>
+      <w:r>
+        <w:rPr>
+          <w:rFonts w:ascii="Consolas" w:eastAsia="Times New Roman" w:hAnsi="Consolas" w:cs="Times New Roman"/>
+          <w:color w:val="70AD47" w:themeColor="accent6"/>
+          <w:sz w:val="21"/>
+          <w:szCs w:val="21"/>
+          <w:lang w:eastAsia="fr-FR"/>
+        </w:rPr>
+        <w:t xml:space="preserve"> //vérifier les valeurs de $_SESSION pour déboguer</w:t>
+      </w:r>
+    </w:p>
+    <w:p>
+      <w:pPr>
+        <w:shd w:val="clear" w:color="auto" w:fill="000000"/>
+        <w:spacing w:after="0" w:line="285" w:lineRule="atLeast"/>
+        <w:rPr>
+          <w:rFonts w:ascii="Consolas" w:eastAsia="Times New Roman" w:hAnsi="Consolas" w:cs="Times New Roman"/>
+          <w:color w:val="FFFFFF"/>
+          <w:sz w:val="21"/>
+          <w:szCs w:val="21"/>
+          <w:lang w:eastAsia="fr-FR"/>
+        </w:rPr>
+      </w:pPr>
+      <w:r>
+        <w:rPr>
+          <w:rFonts w:ascii="Consolas" w:eastAsia="Times New Roman" w:hAnsi="Consolas" w:cs="Times New Roman"/>
+          <w:color w:val="808080"/>
+          <w:sz w:val="21"/>
+          <w:szCs w:val="21"/>
+          <w:lang w:eastAsia="fr-FR"/>
+        </w:rPr>
+        <w:t>&lt;/</w:t>
+      </w:r>
+      <w:proofErr w:type="spellStart"/>
+      <w:r>
+        <w:rPr>
+          <w:rFonts w:ascii="Consolas" w:eastAsia="Times New Roman" w:hAnsi="Consolas" w:cs="Times New Roman"/>
+          <w:color w:val="569CD6"/>
+          <w:sz w:val="21"/>
+          <w:szCs w:val="21"/>
+          <w:lang w:eastAsia="fr-FR"/>
+        </w:rPr>
+        <w:t>pre</w:t>
+      </w:r>
+      <w:proofErr w:type="spellEnd"/>
+      <w:r>
+        <w:rPr>
+          <w:rFonts w:ascii="Consolas" w:eastAsia="Times New Roman" w:hAnsi="Consolas" w:cs="Times New Roman"/>
+          <w:color w:val="808080"/>
+          <w:sz w:val="21"/>
+          <w:szCs w:val="21"/>
+          <w:lang w:eastAsia="fr-FR"/>
+        </w:rPr>
+        <w:t>&gt;</w:t>
+      </w:r>
+    </w:p>
+    <w:p>
+      <w:pPr>
+        <w:pStyle w:val="Sansinterligne"/>
+      </w:pPr>
+    </w:p>
+    <w:p>
+      <w:pPr>
+        <w:pStyle w:val="Sansinterligne"/>
+      </w:pPr>
+      <w:r>
+        <w:t>Sprint 7 — Authentification utilisateur</w:t>
+      </w:r>
+    </w:p>
+    <w:p>
+      <w:pPr>
+        <w:pStyle w:val="Sansinterligne"/>
+      </w:pPr>
+      <w:r>
+        <w:t xml:space="preserve">Mise en place du système d'inscription, de connexion et de déconnexion des utilisateurs. Les données saisies sont validées côté PHP avant leur insertion en base de données. Les mots de passe sont sécurisés avec </w:t>
+      </w:r>
+      <w:proofErr w:type="spellStart"/>
+      <w:r>
+        <w:t>password_hash</w:t>
+      </w:r>
+      <w:proofErr w:type="spellEnd"/>
+      <w:r>
+        <w:t xml:space="preserve">() et vérifiés avec </w:t>
+      </w:r>
+      <w:proofErr w:type="spellStart"/>
+      <w:r>
+        <w:t>password_verify</w:t>
+      </w:r>
+      <w:proofErr w:type="spellEnd"/>
+      <w:r>
+        <w:t>(). Mise en place de contraintes d'unicité sur le pseudo et l'adresse email ainsi que de la gestion des erreurs PDO. Création d'une session utilisateur permettant de protéger l'accès au profil et d'adapter dynamiquement le header selon l'état de connexion. Tests fonctionnels réalisés sur les différents parcours d'authentification.</w:t>
+      </w:r>
+    </w:p>
+    <w:p>
+      <w:pPr>
+        <w:pStyle w:val="Sansinterligne"/>
+      </w:pPr>
+    </w:p>
+    <w:p>
+      <w:pPr>
+        <w:pStyle w:val="Sansinterligne"/>
+      </w:pPr>
       <w:bookmarkStart w:id="0" w:name="_GoBack"/>
       <w:bookmarkEnd w:id="0"/>
     </w:p>
@@ -3859,6 +6104,7 @@
   <w:style w:type="character" w:default="1" w:styleId="Policepardfaut">
     <w:name w:val="Default Paragraph Font"/>
     <w:uiPriority w:val="1"/>
+    <w:semiHidden/>
     <w:unhideWhenUsed/>
   </w:style>
   <w:style w:type="table" w:default="1" w:styleId="TableauNormal">

</xml_diff>

<commit_message>
feat : developpement fonctionnalité ajout livre
</commit_message>
<xml_diff>
--- a/docs/XX_EP_Journal_de_Bord.docx
+++ b/docs/XX_EP_Journal_de_Bord.docx
@@ -5180,10 +5180,73 @@
     </w:p>
     <w:p>
       <w:pPr>
-        <w:pStyle w:val="Sansinterligne"/>
-      </w:pPr>
+        <w:pStyle w:val="Titre1"/>
+      </w:pPr>
+      <w:r>
+        <w:t>Sprint 8 : Espace utilisateur / modification du profil</w:t>
+      </w:r>
+    </w:p>
+    <w:p>
+      <w:r>
+        <w:t>Mise en place de la carte profil en dynamique selon l’id utilisateur. Ajout fonctionnalité de modifications des informations avec un traitement et modification dans la base de données. Construction d’une requête SQL dynamique avec un tableau modification issu de la fonction POST, création d’un tableau utilisé que pour la requête SQL (</w:t>
+      </w:r>
+      <w:proofErr w:type="spellStart"/>
+      <w:r>
+        <w:t>modification_sql</w:t>
+      </w:r>
+      <w:proofErr w:type="spellEnd"/>
+      <w:r>
+        <w:t xml:space="preserve"> : reprise de la syntaxe attendue + </w:t>
+      </w:r>
+      <w:proofErr w:type="spellStart"/>
+      <w:r>
+        <w:t>implode</w:t>
+      </w:r>
+      <w:proofErr w:type="spellEnd"/>
+      <w:r>
+        <w:t xml:space="preserve"> (pour transformer un tableau en chaine de caractère). De même que pour la variable $paramètres</w:t>
+      </w:r>
+    </w:p>
+    <w:p/>
+    <w:p>
+      <w:pPr>
+        <w:pStyle w:val="Titre2"/>
+      </w:pPr>
+      <w:r>
+        <w:t>Sprint 9 : recherches des livres</w:t>
+      </w:r>
+    </w:p>
+    <w:p>
+      <w:r>
+        <w:t>Choix : Google Books, mais pour cela faut créer une clé d’accès API avec Google Cloud. La clé étant privée, il faut créer un fichier config/</w:t>
+      </w:r>
+      <w:proofErr w:type="spellStart"/>
+      <w:r>
+        <w:t>api.php</w:t>
+      </w:r>
+      <w:proofErr w:type="spellEnd"/>
+      <w:r>
+        <w:t xml:space="preserve"> et créer un fichier .</w:t>
+      </w:r>
+      <w:proofErr w:type="spellStart"/>
+      <w:r>
+        <w:t>gitignore</w:t>
+      </w:r>
+      <w:proofErr w:type="spellEnd"/>
+      <w:r>
+        <w:t xml:space="preserve"> pour ne pas le diffuser sur github</w:t>
+      </w:r>
       <w:bookmarkStart w:id="0" w:name="_GoBack"/>
       <w:bookmarkEnd w:id="0"/>
+    </w:p>
+    <w:p>
+      <w:r>
+        <w:lastRenderedPageBreak/>
+        <w:t xml:space="preserve"> </w:t>
+      </w:r>
+      <w:r>
+        <w:t xml:space="preserve">  </w:t>
+      </w:r>
     </w:p>
     <w:sectPr>
       <w:pgSz w:w="11906" w:h="16838"/>

</xml_diff>